<commit_message>
fix FASE 3 Folder
</commit_message>
<xml_diff>
--- a/Fase 2/Evidencias Proyecto/Diccionario Datos .docx
+++ b/Fase 2/Evidencias Proyecto/Diccionario Datos .docx
@@ -1,6 +1,6 @@
 
 <file path=word/document.xml><?xml version="1.0" encoding="utf-8"?>
-<w:document xmlns:wpc="http://schemas.microsoft.com/office/word/2010/wordprocessingCanvas" xmlns:cx="http://schemas.microsoft.com/office/drawing/2014/chartex" xmlns:cx1="http://schemas.microsoft.com/office/drawing/2015/9/8/chartex" xmlns:cx2="http://schemas.microsoft.com/office/drawing/2015/10/21/chartex" xmlns:cx3="http://schemas.microsoft.com/office/drawing/2016/5/9/chartex" xmlns:cx4="http://schemas.microsoft.com/office/drawing/2016/5/10/chartex" xmlns:cx5="http://schemas.microsoft.com/office/drawing/2016/5/11/chartex" xmlns:cx6="http://schemas.microsoft.com/office/drawing/2016/5/12/chartex" xmlns:cx7="http://schemas.microsoft.com/office/drawing/2016/5/13/chartex" xmlns:cx8="http://schemas.microsoft.com/office/drawing/2016/5/14/chartex" xmlns:mc="http://schemas.openxmlformats.org/markup-compatibility/2006" xmlns:aink="http://schemas.microsoft.com/office/drawing/2016/ink" xmlns:am3d="http://schemas.microsoft.com/office/drawing/2017/model3d" xmlns:o="urn:schemas-microsoft-com:office:office" xmlns:oel="http://schemas.microsoft.com/office/2019/extlst" xmlns:r="http://schemas.openxmlformats.org/officeDocument/2006/relationships" xmlns:m="http://schemas.openxmlformats.org/officeDocument/2006/math" xmlns:v="urn:schemas-microsoft-com:vml" xmlns:wp14="http://schemas.microsoft.com/office/word/2010/wordprocessingDrawing" xmlns:wp="http://schemas.openxmlformats.org/drawingml/2006/wordprocessingDrawing" xmlns:w10="urn:schemas-microsoft-com:office:word" xmlns:w="http://schemas.openxmlformats.org/wordprocessingml/2006/main" xmlns:w14="http://schemas.microsoft.com/office/word/2010/wordml" xmlns:w15="http://schemas.microsoft.com/office/word/2012/wordml" xmlns:w16cex="http://schemas.microsoft.com/office/word/2018/wordml/cex" xmlns:w16cid="http://schemas.microsoft.com/office/word/2016/wordml/cid" xmlns:w16="http://schemas.microsoft.com/office/word/2018/wordml" xmlns:w16sdtdh="http://schemas.microsoft.com/office/word/2020/wordml/sdtdatahash" xmlns:w16se="http://schemas.microsoft.com/office/word/2015/wordml/symex" xmlns:wpg="http://schemas.microsoft.com/office/word/2010/wordprocessingGroup" xmlns:wpi="http://schemas.microsoft.com/office/word/2010/wordprocessingInk" xmlns:wne="http://schemas.microsoft.com/office/word/2006/wordml" xmlns:wps="http://schemas.microsoft.com/office/word/2010/wordprocessingShape" mc:Ignorable="w14 w15 w16se w16cid w16 w16cex w16sdtdh wp14">
+<w:document xmlns:wpc="http://schemas.microsoft.com/office/word/2010/wordprocessingCanvas" xmlns:cx="http://schemas.microsoft.com/office/drawing/2014/chartex" xmlns:cx1="http://schemas.microsoft.com/office/drawing/2015/9/8/chartex" xmlns:cx2="http://schemas.microsoft.com/office/drawing/2015/10/21/chartex" xmlns:cx3="http://schemas.microsoft.com/office/drawing/2016/5/9/chartex" xmlns:cx4="http://schemas.microsoft.com/office/drawing/2016/5/10/chartex" xmlns:cx5="http://schemas.microsoft.com/office/drawing/2016/5/11/chartex" xmlns:cx6="http://schemas.microsoft.com/office/drawing/2016/5/12/chartex" xmlns:cx7="http://schemas.microsoft.com/office/drawing/2016/5/13/chartex" xmlns:cx8="http://schemas.microsoft.com/office/drawing/2016/5/14/chartex" xmlns:mc="http://schemas.openxmlformats.org/markup-compatibility/2006" xmlns:aink="http://schemas.microsoft.com/office/drawing/2016/ink" xmlns:am3d="http://schemas.microsoft.com/office/drawing/2017/model3d" xmlns:o="urn:schemas-microsoft-com:office:office" xmlns:oel="http://schemas.microsoft.com/office/2019/extlst" xmlns:r="http://schemas.openxmlformats.org/officeDocument/2006/relationships" xmlns:m="http://schemas.openxmlformats.org/officeDocument/2006/math" xmlns:v="urn:schemas-microsoft-com:vml" xmlns:wp14="http://schemas.microsoft.com/office/word/2010/wordprocessingDrawing" xmlns:wp="http://schemas.openxmlformats.org/drawingml/2006/wordprocessingDrawing" xmlns:w10="urn:schemas-microsoft-com:office:word" xmlns:w="http://schemas.openxmlformats.org/wordprocessingml/2006/main" xmlns:w14="http://schemas.microsoft.com/office/word/2010/wordml" xmlns:w15="http://schemas.microsoft.com/office/word/2012/wordml" xmlns:w16cex="http://schemas.microsoft.com/office/word/2018/wordml/cex" xmlns:w16cid="http://schemas.microsoft.com/office/word/2016/wordml/cid" xmlns:w16="http://schemas.microsoft.com/office/word/2018/wordml" xmlns:w16du="http://schemas.microsoft.com/office/word/2023/wordml/word16du" xmlns:w16sdtdh="http://schemas.microsoft.com/office/word/2020/wordml/sdtdatahash" xmlns:w16sdtfl="http://schemas.microsoft.com/office/word/2024/wordml/sdtformatlock" xmlns:w16se="http://schemas.microsoft.com/office/word/2015/wordml/symex" xmlns:wpg="http://schemas.microsoft.com/office/word/2010/wordprocessingGroup" xmlns:wpi="http://schemas.microsoft.com/office/word/2010/wordprocessingInk" xmlns:wne="http://schemas.microsoft.com/office/word/2006/wordml" xmlns:wps="http://schemas.microsoft.com/office/word/2010/wordprocessingShape" mc:Ignorable="w14 w15 w16se w16cid w16 w16cex w16sdtdh w16sdtfl w16du wp14">
   <w:body>
     <w:p>
       <w:pPr>
@@ -47,17 +47,8 @@
           <w:sz w:val="34"/>
           <w:szCs w:val="34"/>
         </w:rPr>
-        <w:t xml:space="preserve">TABLA: </w:t>
+        <w:t>TABLA: cat_tipo_vivienda</w:t>
       </w:r>
-      <w:proofErr w:type="spellStart"/>
-      <w:r>
-        <w:rPr>
-          <w:sz w:val="34"/>
-          <w:szCs w:val="34"/>
-        </w:rPr>
-        <w:t>cat_tipo_vivienda</w:t>
-      </w:r>
-      <w:proofErr w:type="spellEnd"/>
     </w:p>
     <w:p>
       <w:pPr>
@@ -349,13 +340,8 @@
               <w:jc w:val="center"/>
             </w:pPr>
             <w:r>
-              <w:t xml:space="preserve">Identificador único </w:t>
-            </w:r>
-            <w:proofErr w:type="spellStart"/>
-            <w:r>
-              <w:t>auto-incremental</w:t>
-            </w:r>
-            <w:proofErr w:type="spellEnd"/>
+              <w:t>Identificador único auto-incremental</w:t>
+            </w:r>
           </w:p>
         </w:tc>
         <w:tc>
@@ -523,17 +509,8 @@
           <w:sz w:val="34"/>
           <w:szCs w:val="34"/>
         </w:rPr>
-        <w:t xml:space="preserve">TABLA: </w:t>
+        <w:t>TABLA: cat_tipo_dispositivo</w:t>
       </w:r>
-      <w:proofErr w:type="spellStart"/>
-      <w:r>
-        <w:rPr>
-          <w:sz w:val="34"/>
-          <w:szCs w:val="34"/>
-        </w:rPr>
-        <w:t>cat_tipo_dispositivo</w:t>
-      </w:r>
-      <w:proofErr w:type="spellEnd"/>
     </w:p>
     <w:p>
       <w:pPr>
@@ -828,13 +805,8 @@
               <w:jc w:val="center"/>
             </w:pPr>
             <w:r>
-              <w:t xml:space="preserve">Identificador único </w:t>
-            </w:r>
-            <w:proofErr w:type="spellStart"/>
-            <w:r>
-              <w:t>auto-incremental</w:t>
-            </w:r>
-            <w:proofErr w:type="spellEnd"/>
+              <w:t>Identificador único auto-incremental</w:t>
+            </w:r>
           </w:p>
         </w:tc>
         <w:tc>
@@ -1004,17 +976,8 @@
           <w:sz w:val="34"/>
           <w:szCs w:val="34"/>
         </w:rPr>
-        <w:t xml:space="preserve">TABLA: </w:t>
+        <w:t>TABLA: cat_nivel_alerta</w:t>
       </w:r>
-      <w:proofErr w:type="spellStart"/>
-      <w:r>
-        <w:rPr>
-          <w:sz w:val="34"/>
-          <w:szCs w:val="34"/>
-        </w:rPr>
-        <w:t>cat_nivel_alerta</w:t>
-      </w:r>
-      <w:proofErr w:type="spellEnd"/>
     </w:p>
     <w:p>
       <w:pPr>
@@ -1306,13 +1269,8 @@
               <w:jc w:val="center"/>
             </w:pPr>
             <w:r>
-              <w:t xml:space="preserve">Identificador único </w:t>
-            </w:r>
-            <w:proofErr w:type="spellStart"/>
-            <w:r>
-              <w:t>auto-incremental</w:t>
-            </w:r>
-            <w:proofErr w:type="spellEnd"/>
+              <w:t>Identificador único auto-incremental</w:t>
+            </w:r>
           </w:p>
         </w:tc>
         <w:tc>
@@ -1353,11 +1311,9 @@
             <w:pPr>
               <w:jc w:val="center"/>
             </w:pPr>
-            <w:proofErr w:type="spellStart"/>
-            <w:r>
-              <w:t>codigo</w:t>
-            </w:r>
-            <w:proofErr w:type="spellEnd"/>
+            <w:r>
+              <w:t>Código</w:t>
+            </w:r>
           </w:p>
         </w:tc>
         <w:tc>
@@ -1474,11 +1430,9 @@
             <w:pPr>
               <w:jc w:val="center"/>
             </w:pPr>
-            <w:proofErr w:type="spellStart"/>
-            <w:r>
-              <w:t>descripcion</w:t>
-            </w:r>
-            <w:proofErr w:type="spellEnd"/>
+            <w:r>
+              <w:t>descripción</w:t>
+            </w:r>
           </w:p>
         </w:tc>
         <w:tc>
@@ -1603,17 +1557,8 @@
           <w:sz w:val="34"/>
           <w:szCs w:val="34"/>
         </w:rPr>
-        <w:t xml:space="preserve">TABLA: </w:t>
+        <w:t>TABLA: cat_tipo_notificacion</w:t>
       </w:r>
-      <w:proofErr w:type="spellStart"/>
-      <w:r>
-        <w:rPr>
-          <w:sz w:val="34"/>
-          <w:szCs w:val="34"/>
-        </w:rPr>
-        <w:t>cat_tipo_notificacion</w:t>
-      </w:r>
-      <w:proofErr w:type="spellEnd"/>
     </w:p>
     <w:p>
       <w:pPr>
@@ -1905,13 +1850,8 @@
               <w:jc w:val="center"/>
             </w:pPr>
             <w:r>
-              <w:t xml:space="preserve">Identificador único </w:t>
-            </w:r>
-            <w:proofErr w:type="spellStart"/>
-            <w:r>
-              <w:t>auto-incremental</w:t>
-            </w:r>
-            <w:proofErr w:type="spellEnd"/>
+              <w:t>Identificador único auto-incremental</w:t>
+            </w:r>
           </w:p>
         </w:tc>
         <w:tc>
@@ -1952,12 +1892,10 @@
             <w:pPr>
               <w:jc w:val="center"/>
             </w:pPr>
-            <w:proofErr w:type="spellStart"/>
             <w:r>
               <w:lastRenderedPageBreak/>
-              <w:t>codigo</w:t>
-            </w:r>
-            <w:proofErr w:type="spellEnd"/>
+              <w:t>Código</w:t>
+            </w:r>
           </w:p>
         </w:tc>
         <w:tc>
@@ -2074,11 +2012,9 @@
             <w:pPr>
               <w:jc w:val="center"/>
             </w:pPr>
-            <w:proofErr w:type="spellStart"/>
-            <w:r>
-              <w:t>descripcion</w:t>
-            </w:r>
-            <w:proofErr w:type="spellEnd"/>
+            <w:r>
+              <w:t>descripción</w:t>
+            </w:r>
           </w:p>
         </w:tc>
         <w:tc>
@@ -2203,17 +2139,8 @@
           <w:sz w:val="34"/>
           <w:szCs w:val="34"/>
         </w:rPr>
-        <w:t xml:space="preserve">TABLA: </w:t>
+        <w:t>TABLA: cat_comuna</w:t>
       </w:r>
-      <w:proofErr w:type="spellStart"/>
-      <w:r>
-        <w:rPr>
-          <w:sz w:val="34"/>
-          <w:szCs w:val="34"/>
-        </w:rPr>
-        <w:t>cat_comuna</w:t>
-      </w:r>
-      <w:proofErr w:type="spellEnd"/>
     </w:p>
     <w:p>
       <w:pPr>
@@ -2505,13 +2432,8 @@
               <w:jc w:val="center"/>
             </w:pPr>
             <w:r>
-              <w:t xml:space="preserve">Identificador único </w:t>
-            </w:r>
-            <w:proofErr w:type="spellStart"/>
-            <w:r>
-              <w:t>auto-incremental</w:t>
-            </w:r>
-            <w:proofErr w:type="spellEnd"/>
+              <w:t>Identificador único auto-incremental</w:t>
+            </w:r>
           </w:p>
         </w:tc>
         <w:tc>
@@ -3134,11 +3056,9 @@
             <w:pPr>
               <w:jc w:val="center"/>
             </w:pPr>
-            <w:proofErr w:type="spellStart"/>
             <w:r>
               <w:t>creado_en</w:t>
             </w:r>
-            <w:proofErr w:type="spellEnd"/>
           </w:p>
         </w:tc>
         <w:tc>
@@ -3213,20 +3133,7 @@
               <w:jc w:val="center"/>
             </w:pPr>
             <w:r>
-              <w:t xml:space="preserve">Fecha y hora de creación. Default: </w:t>
-            </w:r>
-            <w:proofErr w:type="spellStart"/>
-            <w:proofErr w:type="gramStart"/>
-            <w:r>
-              <w:t>now</w:t>
-            </w:r>
-            <w:proofErr w:type="spellEnd"/>
-            <w:r>
-              <w:t>(</w:t>
-            </w:r>
-            <w:proofErr w:type="gramEnd"/>
-            <w:r>
-              <w:t>)</w:t>
+              <w:t>Fecha y hora de creación. Default: now()</w:t>
             </w:r>
           </w:p>
         </w:tc>
@@ -3268,11 +3175,9 @@
             <w:pPr>
               <w:jc w:val="center"/>
             </w:pPr>
-            <w:proofErr w:type="spellStart"/>
             <w:r>
               <w:t>actualizado_en</w:t>
             </w:r>
-            <w:proofErr w:type="spellEnd"/>
           </w:p>
         </w:tc>
         <w:tc>
@@ -3347,20 +3252,7 @@
               <w:jc w:val="center"/>
             </w:pPr>
             <w:r>
-              <w:t xml:space="preserve">Fecha y hora de última actualización. Default: </w:t>
-            </w:r>
-            <w:proofErr w:type="spellStart"/>
-            <w:proofErr w:type="gramStart"/>
-            <w:r>
-              <w:t>now</w:t>
-            </w:r>
-            <w:proofErr w:type="spellEnd"/>
-            <w:r>
-              <w:t>(</w:t>
-            </w:r>
-            <w:proofErr w:type="gramEnd"/>
-            <w:r>
-              <w:t>)</w:t>
+              <w:t>Fecha y hora de última actualización. Default: now()</w:t>
             </w:r>
           </w:p>
         </w:tc>
@@ -3410,17 +3302,8 @@
           <w:sz w:val="34"/>
           <w:szCs w:val="34"/>
         </w:rPr>
-        <w:t xml:space="preserve">TABLA: </w:t>
+        <w:t>TABLA: auth_identidades</w:t>
       </w:r>
-      <w:proofErr w:type="spellStart"/>
-      <w:r>
-        <w:rPr>
-          <w:sz w:val="34"/>
-          <w:szCs w:val="34"/>
-        </w:rPr>
-        <w:t>auth_identidades</w:t>
-      </w:r>
-      <w:proofErr w:type="spellEnd"/>
     </w:p>
     <w:p>
       <w:pPr>
@@ -3433,21 +3316,8 @@
         <w:t>DESCRIPCIÓN:</w:t>
       </w:r>
       <w:r>
-        <w:t xml:space="preserve"> Identidades de autenticación (email y contraseña </w:t>
+        <w:t xml:space="preserve"> Identidades de autenticación (email y contraseña hasheada). Email único case-insensitive</w:t>
       </w:r>
-      <w:proofErr w:type="spellStart"/>
-      <w:r>
-        <w:t>hasheada</w:t>
-      </w:r>
-      <w:proofErr w:type="spellEnd"/>
-      <w:r>
-        <w:t>). Email único case-</w:t>
-      </w:r>
-      <w:proofErr w:type="spellStart"/>
-      <w:r>
-        <w:t>insensitive</w:t>
-      </w:r>
-      <w:proofErr w:type="spellEnd"/>
     </w:p>
     <w:p>
       <w:pPr>
@@ -3767,11 +3637,9 @@
             <w:pPr>
               <w:jc w:val="center"/>
             </w:pPr>
-            <w:proofErr w:type="spellStart"/>
             <w:r>
               <w:t>usuario_id</w:t>
             </w:r>
-            <w:proofErr w:type="spellEnd"/>
           </w:p>
         </w:tc>
         <w:tc>
@@ -3966,15 +3834,7 @@
               <w:jc w:val="center"/>
             </w:pPr>
             <w:r>
-              <w:t>Email del usuario (único, case-</w:t>
-            </w:r>
-            <w:proofErr w:type="spellStart"/>
-            <w:r>
-              <w:t>insensitive</w:t>
-            </w:r>
-            <w:proofErr w:type="spellEnd"/>
-            <w:r>
-              <w:t>)</w:t>
+              <w:t>Email del usuario (único, case-insensitive)</w:t>
             </w:r>
           </w:p>
         </w:tc>
@@ -4016,11 +3876,9 @@
             <w:pPr>
               <w:jc w:val="center"/>
             </w:pPr>
-            <w:proofErr w:type="spellStart"/>
             <w:r>
               <w:t>contrasena_hash</w:t>
             </w:r>
-            <w:proofErr w:type="spellEnd"/>
           </w:p>
         </w:tc>
         <w:tc>
@@ -4137,11 +3995,9 @@
             <w:pPr>
               <w:jc w:val="center"/>
             </w:pPr>
-            <w:proofErr w:type="spellStart"/>
             <w:r>
               <w:t>ultimo_acceso</w:t>
             </w:r>
-            <w:proofErr w:type="spellEnd"/>
           </w:p>
         </w:tc>
         <w:tc>
@@ -4258,11 +4114,9 @@
             <w:pPr>
               <w:jc w:val="center"/>
             </w:pPr>
-            <w:proofErr w:type="spellStart"/>
             <w:r>
               <w:t>creado_en</w:t>
             </w:r>
-            <w:proofErr w:type="spellEnd"/>
           </w:p>
         </w:tc>
         <w:tc>
@@ -4337,20 +4191,7 @@
               <w:jc w:val="center"/>
             </w:pPr>
             <w:r>
-              <w:t xml:space="preserve">Fecha de creación. Default: </w:t>
-            </w:r>
-            <w:proofErr w:type="spellStart"/>
-            <w:proofErr w:type="gramStart"/>
-            <w:r>
-              <w:t>now</w:t>
-            </w:r>
-            <w:proofErr w:type="spellEnd"/>
-            <w:r>
-              <w:t>(</w:t>
-            </w:r>
-            <w:proofErr w:type="gramEnd"/>
-            <w:r>
-              <w:t>)</w:t>
+              <w:t>Fecha de creación. Default: now()</w:t>
             </w:r>
           </w:p>
         </w:tc>
@@ -4392,11 +4233,9 @@
             <w:pPr>
               <w:jc w:val="center"/>
             </w:pPr>
-            <w:proofErr w:type="spellStart"/>
             <w:r>
               <w:t>actualizado_en</w:t>
             </w:r>
-            <w:proofErr w:type="spellEnd"/>
           </w:p>
         </w:tc>
         <w:tc>
@@ -4471,20 +4310,7 @@
               <w:jc w:val="center"/>
             </w:pPr>
             <w:r>
-              <w:t xml:space="preserve">Fecha de actualización. Default: </w:t>
-            </w:r>
-            <w:proofErr w:type="spellStart"/>
-            <w:proofErr w:type="gramStart"/>
-            <w:r>
-              <w:t>now</w:t>
-            </w:r>
-            <w:proofErr w:type="spellEnd"/>
-            <w:r>
-              <w:t>(</w:t>
-            </w:r>
-            <w:proofErr w:type="gramEnd"/>
-            <w:r>
-              <w:t>)</w:t>
+              <w:t>Fecha de actualización. Default: now()</w:t>
             </w:r>
           </w:p>
         </w:tc>
@@ -4532,23 +4358,7 @@
         <w:spacing w:before="240" w:after="240"/>
       </w:pPr>
       <w:r>
-        <w:t>Email debe cumplir formato: ^[A-Za-z0-</w:t>
-      </w:r>
-      <w:proofErr w:type="gramStart"/>
-      <w:r>
-        <w:t>9._</w:t>
-      </w:r>
-      <w:proofErr w:type="gramEnd"/>
-      <w:r>
-        <w:t>%+-]+@[A-Za-z0-9.-]+.[A-</w:t>
-      </w:r>
-      <w:proofErr w:type="spellStart"/>
-      <w:r>
-        <w:t>Za</w:t>
-      </w:r>
-      <w:proofErr w:type="spellEnd"/>
-      <w:r>
-        <w:t>-z]{2,}$</w:t>
+        <w:t>Email debe cumplir formato: ^[A-Za-z0-9._%+-]+@[A-Za-z0-9.-]+.[A-Za-z]{2,}$</w:t>
       </w:r>
     </w:p>
     <w:p>
@@ -4795,11 +4605,9 @@
             <w:pPr>
               <w:jc w:val="center"/>
             </w:pPr>
-            <w:proofErr w:type="spellStart"/>
             <w:r>
               <w:t>usuario_id</w:t>
             </w:r>
-            <w:proofErr w:type="spellEnd"/>
           </w:p>
         </w:tc>
         <w:tc>
@@ -4917,12 +4725,10 @@
             <w:pPr>
               <w:jc w:val="center"/>
             </w:pPr>
-            <w:proofErr w:type="spellStart"/>
             <w:r>
               <w:lastRenderedPageBreak/>
               <w:t>rut</w:t>
             </w:r>
-            <w:proofErr w:type="spellEnd"/>
           </w:p>
         </w:tc>
         <w:tc>
@@ -5280,11 +5086,9 @@
             <w:pPr>
               <w:jc w:val="center"/>
             </w:pPr>
-            <w:proofErr w:type="spellStart"/>
             <w:r>
               <w:t>tipo_vivienda_id</w:t>
             </w:r>
-            <w:proofErr w:type="spellEnd"/>
           </w:p>
         </w:tc>
         <w:tc>
@@ -5359,15 +5163,7 @@
               <w:jc w:val="center"/>
             </w:pPr>
             <w:r>
-              <w:t xml:space="preserve">Referencia a </w:t>
-            </w:r>
-            <w:proofErr w:type="spellStart"/>
-            <w:r>
-              <w:t>cat_tipo_vivienda</w:t>
-            </w:r>
-            <w:proofErr w:type="spellEnd"/>
-            <w:r>
-              <w:t>(id)</w:t>
+              <w:t>Referencia a cat_tipo_vivienda(id)</w:t>
             </w:r>
           </w:p>
         </w:tc>
@@ -5410,11 +5206,9 @@
             <w:pPr>
               <w:jc w:val="center"/>
             </w:pPr>
-            <w:proofErr w:type="spellStart"/>
             <w:r>
               <w:t>creado_en</w:t>
             </w:r>
-            <w:proofErr w:type="spellEnd"/>
           </w:p>
         </w:tc>
         <w:tc>
@@ -5489,20 +5283,7 @@
               <w:jc w:val="center"/>
             </w:pPr>
             <w:r>
-              <w:t xml:space="preserve">Fecha de creación. Default: </w:t>
-            </w:r>
-            <w:proofErr w:type="spellStart"/>
-            <w:proofErr w:type="gramStart"/>
-            <w:r>
-              <w:t>now</w:t>
-            </w:r>
-            <w:proofErr w:type="spellEnd"/>
-            <w:r>
-              <w:t>(</w:t>
-            </w:r>
-            <w:proofErr w:type="gramEnd"/>
-            <w:r>
-              <w:t>)</w:t>
+              <w:t>Fecha de creación. Default: now()</w:t>
             </w:r>
           </w:p>
         </w:tc>
@@ -5545,11 +5326,9 @@
             <w:pPr>
               <w:jc w:val="center"/>
             </w:pPr>
-            <w:proofErr w:type="spellStart"/>
             <w:r>
               <w:t>actualizado_en</w:t>
             </w:r>
-            <w:proofErr w:type="spellEnd"/>
           </w:p>
         </w:tc>
         <w:tc>
@@ -5624,20 +5403,7 @@
               <w:jc w:val="center"/>
             </w:pPr>
             <w:r>
-              <w:t xml:space="preserve">Fecha de actualización. Default: </w:t>
-            </w:r>
-            <w:proofErr w:type="spellStart"/>
-            <w:proofErr w:type="gramStart"/>
-            <w:r>
-              <w:t>now</w:t>
-            </w:r>
-            <w:proofErr w:type="spellEnd"/>
-            <w:r>
-              <w:t>(</w:t>
-            </w:r>
-            <w:proofErr w:type="gramEnd"/>
-            <w:r>
-              <w:t>)</w:t>
+              <w:t>Fecha de actualización. Default: now()</w:t>
             </w:r>
           </w:p>
         </w:tc>
@@ -6010,13 +5776,8 @@
               <w:jc w:val="center"/>
             </w:pPr>
             <w:r>
-              <w:t xml:space="preserve">Identificador único </w:t>
-            </w:r>
-            <w:proofErr w:type="spellStart"/>
-            <w:r>
-              <w:t>auto-incremental</w:t>
-            </w:r>
-            <w:proofErr w:type="spellEnd"/>
+              <w:t>Identificador único auto-incremental</w:t>
+            </w:r>
           </w:p>
         </w:tc>
         <w:tc>
@@ -6058,12 +5819,10 @@
             <w:pPr>
               <w:jc w:val="center"/>
             </w:pPr>
-            <w:proofErr w:type="spellStart"/>
             <w:r>
               <w:lastRenderedPageBreak/>
               <w:t>usuario_id</w:t>
             </w:r>
-            <w:proofErr w:type="spellEnd"/>
           </w:p>
         </w:tc>
         <w:tc>
@@ -6421,11 +6180,9 @@
             <w:pPr>
               <w:jc w:val="center"/>
             </w:pPr>
-            <w:proofErr w:type="spellStart"/>
             <w:r>
               <w:t>depto</w:t>
             </w:r>
-            <w:proofErr w:type="spellEnd"/>
           </w:p>
         </w:tc>
         <w:tc>
@@ -6543,11 +6300,9 @@
             <w:pPr>
               <w:jc w:val="center"/>
             </w:pPr>
-            <w:proofErr w:type="spellStart"/>
             <w:r>
               <w:t>comuna_id</w:t>
             </w:r>
-            <w:proofErr w:type="spellEnd"/>
           </w:p>
         </w:tc>
         <w:tc>
@@ -6622,15 +6377,7 @@
               <w:jc w:val="center"/>
             </w:pPr>
             <w:r>
-              <w:t xml:space="preserve">Referencia a </w:t>
-            </w:r>
-            <w:proofErr w:type="spellStart"/>
-            <w:r>
-              <w:t>cat_comuna</w:t>
-            </w:r>
-            <w:proofErr w:type="spellEnd"/>
-            <w:r>
-              <w:t>(id)</w:t>
+              <w:t>Referencia a cat_comuna(id)</w:t>
             </w:r>
           </w:p>
         </w:tc>
@@ -6673,11 +6420,9 @@
             <w:pPr>
               <w:jc w:val="center"/>
             </w:pPr>
-            <w:proofErr w:type="spellStart"/>
             <w:r>
               <w:t>creado_en</w:t>
             </w:r>
-            <w:proofErr w:type="spellEnd"/>
           </w:p>
         </w:tc>
         <w:tc>
@@ -6752,20 +6497,7 @@
               <w:jc w:val="center"/>
             </w:pPr>
             <w:r>
-              <w:t xml:space="preserve">Fecha de creación. Default: </w:t>
-            </w:r>
-            <w:proofErr w:type="spellStart"/>
-            <w:proofErr w:type="gramStart"/>
-            <w:r>
-              <w:t>now</w:t>
-            </w:r>
-            <w:proofErr w:type="spellEnd"/>
-            <w:r>
-              <w:t>(</w:t>
-            </w:r>
-            <w:proofErr w:type="gramEnd"/>
-            <w:r>
-              <w:t>)</w:t>
+              <w:t>Fecha de creación. Default: now()</w:t>
             </w:r>
           </w:p>
         </w:tc>
@@ -6808,11 +6540,9 @@
             <w:pPr>
               <w:jc w:val="center"/>
             </w:pPr>
-            <w:proofErr w:type="spellStart"/>
             <w:r>
               <w:t>actualizado_en</w:t>
             </w:r>
-            <w:proofErr w:type="spellEnd"/>
           </w:p>
         </w:tc>
         <w:tc>
@@ -6887,20 +6617,7 @@
               <w:jc w:val="center"/>
             </w:pPr>
             <w:r>
-              <w:t xml:space="preserve">Fecha de actualización. Default: </w:t>
-            </w:r>
-            <w:proofErr w:type="spellStart"/>
-            <w:proofErr w:type="gramStart"/>
-            <w:r>
-              <w:t>now</w:t>
-            </w:r>
-            <w:proofErr w:type="spellEnd"/>
-            <w:r>
-              <w:t>(</w:t>
-            </w:r>
-            <w:proofErr w:type="gramEnd"/>
-            <w:r>
-              <w:t>)</w:t>
+              <w:t>Fecha de actualización. Default: now()</w:t>
             </w:r>
           </w:p>
         </w:tc>
@@ -6948,23 +6665,7 @@
         <w:spacing w:before="240" w:after="240"/>
       </w:pPr>
       <w:r>
-        <w:t>Calle no puede estar vacía (</w:t>
-      </w:r>
-      <w:proofErr w:type="spellStart"/>
-      <w:r>
-        <w:t>length</w:t>
-      </w:r>
-      <w:proofErr w:type="spellEnd"/>
-      <w:r>
-        <w:t>(</w:t>
-      </w:r>
-      <w:proofErr w:type="spellStart"/>
-      <w:r>
-        <w:t>trim</w:t>
-      </w:r>
-      <w:proofErr w:type="spellEnd"/>
-      <w:r>
-        <w:t>(calle)) &gt; 0)</w:t>
+        <w:t>Calle no puede estar vacía (length(trim(calle)) &gt; 0)</w:t>
       </w:r>
     </w:p>
     <w:p>
@@ -7006,15 +6707,7 @@
         <w:t>DESCRIPCIÓN:</w:t>
       </w:r>
       <w:r>
-        <w:t xml:space="preserve"> Roles del sistema para control de acceso RBAC (Role-</w:t>
-      </w:r>
-      <w:proofErr w:type="spellStart"/>
-      <w:r>
-        <w:t>Based</w:t>
-      </w:r>
-      <w:proofErr w:type="spellEnd"/>
-      <w:r>
-        <w:t xml:space="preserve"> Access Control)</w:t>
+        <w:t xml:space="preserve"> Roles del sistema para control de acceso RBAC (Role-Based Access Control)</w:t>
       </w:r>
     </w:p>
     <w:p>
@@ -7294,13 +6987,8 @@
               <w:jc w:val="center"/>
             </w:pPr>
             <w:r>
-              <w:t xml:space="preserve">Identificador único </w:t>
-            </w:r>
-            <w:proofErr w:type="spellStart"/>
-            <w:r>
-              <w:t>auto-incremental</w:t>
-            </w:r>
-            <w:proofErr w:type="spellEnd"/>
+              <w:t>Identificador único auto-incremental</w:t>
+            </w:r>
           </w:p>
         </w:tc>
         <w:tc>
@@ -7418,23 +7106,7 @@
               <w:jc w:val="center"/>
             </w:pPr>
             <w:r>
-              <w:t xml:space="preserve">Nombre del rol (único). </w:t>
-            </w:r>
-            <w:proofErr w:type="spellStart"/>
-            <w:r>
-              <w:t>Ej</w:t>
-            </w:r>
-            <w:proofErr w:type="spellEnd"/>
-            <w:r>
-              <w:t xml:space="preserve">: </w:t>
-            </w:r>
-            <w:proofErr w:type="spellStart"/>
-            <w:r>
-              <w:t>admin</w:t>
-            </w:r>
-            <w:proofErr w:type="spellEnd"/>
-            <w:r>
-              <w:t>, usuario</w:t>
+              <w:t>Nombre del rol (único). Ej: admin, usuario</w:t>
             </w:r>
           </w:p>
         </w:tc>
@@ -7476,11 +7148,9 @@
             <w:pPr>
               <w:jc w:val="center"/>
             </w:pPr>
-            <w:proofErr w:type="spellStart"/>
-            <w:r>
-              <w:t>descripcion</w:t>
-            </w:r>
-            <w:proofErr w:type="spellEnd"/>
+            <w:r>
+              <w:t>descripción</w:t>
+            </w:r>
           </w:p>
         </w:tc>
         <w:tc>
@@ -7602,13 +7272,8 @@
         </w:numPr>
         <w:spacing w:before="240" w:after="0"/>
       </w:pPr>
-      <w:proofErr w:type="spellStart"/>
       <w:r>
-        <w:t>admin</w:t>
-      </w:r>
-      <w:proofErr w:type="spellEnd"/>
-      <w:r>
-        <w:t>: Administrador del sistema</w:t>
+        <w:t>admin: Administrador del sistema</w:t>
       </w:r>
     </w:p>
     <w:p>
@@ -7941,13 +7606,8 @@
               <w:jc w:val="center"/>
             </w:pPr>
             <w:r>
-              <w:t xml:space="preserve">Identificador único </w:t>
-            </w:r>
-            <w:proofErr w:type="spellStart"/>
-            <w:r>
-              <w:t>auto-incremental</w:t>
-            </w:r>
-            <w:proofErr w:type="spellEnd"/>
+              <w:t>Identificador único auto-incremental</w:t>
+            </w:r>
           </w:p>
         </w:tc>
         <w:tc>
@@ -7988,11 +7648,9 @@
             <w:pPr>
               <w:jc w:val="center"/>
             </w:pPr>
-            <w:proofErr w:type="spellStart"/>
-            <w:r>
-              <w:t>codigo</w:t>
-            </w:r>
-            <w:proofErr w:type="spellEnd"/>
+            <w:r>
+              <w:t>Código</w:t>
+            </w:r>
           </w:p>
         </w:tc>
         <w:tc>
@@ -8109,11 +7767,9 @@
             <w:pPr>
               <w:jc w:val="center"/>
             </w:pPr>
-            <w:proofErr w:type="spellStart"/>
-            <w:r>
-              <w:t>descripcion</w:t>
-            </w:r>
-            <w:proofErr w:type="spellEnd"/>
+            <w:r>
+              <w:t>descripción</w:t>
+            </w:r>
           </w:p>
         </w:tc>
         <w:tc>
@@ -8238,17 +7894,8 @@
           <w:sz w:val="34"/>
           <w:szCs w:val="34"/>
         </w:rPr>
-        <w:t xml:space="preserve">TABLA: </w:t>
+        <w:t>TABLA: rol_permiso</w:t>
       </w:r>
-      <w:proofErr w:type="spellStart"/>
-      <w:r>
-        <w:rPr>
-          <w:sz w:val="34"/>
-          <w:szCs w:val="34"/>
-        </w:rPr>
-        <w:t>rol_permiso</w:t>
-      </w:r>
-      <w:proofErr w:type="spellEnd"/>
     </w:p>
     <w:p>
       <w:pPr>
@@ -8541,13 +8188,8 @@
               <w:jc w:val="center"/>
             </w:pPr>
             <w:r>
-              <w:t xml:space="preserve">Identificador único </w:t>
-            </w:r>
-            <w:proofErr w:type="spellStart"/>
-            <w:r>
-              <w:t>auto-incremental</w:t>
-            </w:r>
-            <w:proofErr w:type="spellEnd"/>
+              <w:t>Identificador único auto-incremental</w:t>
+            </w:r>
           </w:p>
         </w:tc>
         <w:tc>
@@ -8588,11 +8230,9 @@
             <w:pPr>
               <w:jc w:val="center"/>
             </w:pPr>
-            <w:proofErr w:type="spellStart"/>
             <w:r>
               <w:t>rol_id</w:t>
             </w:r>
-            <w:proofErr w:type="spellEnd"/>
           </w:p>
         </w:tc>
         <w:tc>
@@ -8709,11 +8349,9 @@
             <w:pPr>
               <w:jc w:val="center"/>
             </w:pPr>
-            <w:proofErr w:type="spellStart"/>
             <w:r>
               <w:t>permiso_id</w:t>
             </w:r>
-            <w:proofErr w:type="spellEnd"/>
           </w:p>
         </w:tc>
         <w:tc>
@@ -8836,23 +8474,7 @@
         <w:spacing w:before="240" w:after="240"/>
       </w:pPr>
       <w:r>
-        <w:t>Combinación única de (</w:t>
-      </w:r>
-      <w:proofErr w:type="spellStart"/>
-      <w:r>
-        <w:t>rol_id</w:t>
-      </w:r>
-      <w:proofErr w:type="spellEnd"/>
-      <w:r>
-        <w:t xml:space="preserve">, </w:t>
-      </w:r>
-      <w:proofErr w:type="spellStart"/>
-      <w:r>
-        <w:t>permiso_id</w:t>
-      </w:r>
-      <w:proofErr w:type="spellEnd"/>
-      <w:r>
-        <w:t>)</w:t>
+        <w:t>Combinación única de (rol_id, permiso_id)</w:t>
       </w:r>
     </w:p>
     <w:p>
@@ -8880,17 +8502,8 @@
           <w:sz w:val="34"/>
           <w:szCs w:val="34"/>
         </w:rPr>
-        <w:t xml:space="preserve">TABLA: </w:t>
+        <w:t>TABLA: usuario_rol</w:t>
       </w:r>
-      <w:proofErr w:type="spellStart"/>
-      <w:r>
-        <w:rPr>
-          <w:sz w:val="34"/>
-          <w:szCs w:val="34"/>
-        </w:rPr>
-        <w:t>usuario_rol</w:t>
-      </w:r>
-      <w:proofErr w:type="spellEnd"/>
     </w:p>
     <w:p>
       <w:pPr>
@@ -9182,13 +8795,8 @@
               <w:jc w:val="center"/>
             </w:pPr>
             <w:r>
-              <w:t xml:space="preserve">Identificador único </w:t>
-            </w:r>
-            <w:proofErr w:type="spellStart"/>
-            <w:r>
-              <w:t>auto-incremental</w:t>
-            </w:r>
-            <w:proofErr w:type="spellEnd"/>
+              <w:t>Identificador único auto-incremental</w:t>
+            </w:r>
           </w:p>
         </w:tc>
         <w:tc>
@@ -9229,11 +8837,9 @@
             <w:pPr>
               <w:jc w:val="center"/>
             </w:pPr>
-            <w:proofErr w:type="spellStart"/>
             <w:r>
               <w:t>usuario_id</w:t>
             </w:r>
-            <w:proofErr w:type="spellEnd"/>
           </w:p>
         </w:tc>
         <w:tc>
@@ -9350,11 +8956,9 @@
             <w:pPr>
               <w:jc w:val="center"/>
             </w:pPr>
-            <w:proofErr w:type="spellStart"/>
             <w:r>
               <w:t>rol_id</w:t>
             </w:r>
-            <w:proofErr w:type="spellEnd"/>
           </w:p>
         </w:tc>
         <w:tc>
@@ -9478,23 +9082,7 @@
         <w:spacing w:before="240" w:after="240"/>
       </w:pPr>
       <w:r>
-        <w:t>Combinación única de (</w:t>
-      </w:r>
-      <w:proofErr w:type="spellStart"/>
-      <w:r>
-        <w:t>usuario_id</w:t>
-      </w:r>
-      <w:proofErr w:type="spellEnd"/>
-      <w:r>
-        <w:t xml:space="preserve">, </w:t>
-      </w:r>
-      <w:proofErr w:type="spellStart"/>
-      <w:r>
-        <w:t>rol_id</w:t>
-      </w:r>
-      <w:proofErr w:type="spellEnd"/>
-      <w:r>
-        <w:t>)</w:t>
+        <w:t>Combinación única de (usuario_id, rol_id)</w:t>
       </w:r>
     </w:p>
     <w:p>
@@ -9815,13 +9403,8 @@
               <w:jc w:val="center"/>
             </w:pPr>
             <w:r>
-              <w:t xml:space="preserve">Identificador único </w:t>
-            </w:r>
-            <w:proofErr w:type="spellStart"/>
-            <w:r>
-              <w:t>auto-incremental</w:t>
-            </w:r>
-            <w:proofErr w:type="spellEnd"/>
+              <w:t>Identificador único auto-incremental</w:t>
+            </w:r>
           </w:p>
         </w:tc>
         <w:tc>
@@ -9862,11 +9445,9 @@
             <w:pPr>
               <w:jc w:val="center"/>
             </w:pPr>
-            <w:proofErr w:type="spellStart"/>
             <w:r>
               <w:t>usuario_id</w:t>
             </w:r>
-            <w:proofErr w:type="spellEnd"/>
           </w:p>
         </w:tc>
         <w:tc>
@@ -10102,11 +9683,9 @@
             <w:pPr>
               <w:jc w:val="center"/>
             </w:pPr>
-            <w:proofErr w:type="spellStart"/>
             <w:r>
               <w:t>tipo_dispositivo_id</w:t>
             </w:r>
-            <w:proofErr w:type="spellEnd"/>
           </w:p>
         </w:tc>
         <w:tc>
@@ -10181,15 +9760,7 @@
               <w:jc w:val="center"/>
             </w:pPr>
             <w:r>
-              <w:t xml:space="preserve">Referencia a </w:t>
-            </w:r>
-            <w:proofErr w:type="spellStart"/>
-            <w:r>
-              <w:t>cat_tipo_dispositivo</w:t>
-            </w:r>
-            <w:proofErr w:type="spellEnd"/>
-            <w:r>
-              <w:t>(id)</w:t>
+              <w:t>Referencia a cat_tipo_dispositivo(id)</w:t>
             </w:r>
           </w:p>
         </w:tc>
@@ -10231,11 +9802,9 @@
             <w:pPr>
               <w:jc w:val="center"/>
             </w:pPr>
-            <w:proofErr w:type="spellStart"/>
             <w:r>
               <w:t>potencia_promedio_w</w:t>
             </w:r>
-            <w:proofErr w:type="spellEnd"/>
           </w:p>
         </w:tc>
         <w:tc>
@@ -10290,13 +9859,8 @@
             <w:pPr>
               <w:jc w:val="center"/>
             </w:pPr>
-            <w:proofErr w:type="gramStart"/>
-            <w:r>
-              <w:t>NUMERIC(</w:t>
-            </w:r>
-            <w:proofErr w:type="gramEnd"/>
-            <w:r>
-              <w:t>10,2)</w:t>
+            <w:r>
+              <w:t>NUMERIC(10,2)</w:t>
             </w:r>
           </w:p>
         </w:tc>
@@ -10357,11 +9921,9 @@
             <w:pPr>
               <w:jc w:val="center"/>
             </w:pPr>
-            <w:proofErr w:type="spellStart"/>
             <w:r>
               <w:t>horas_uso_diario</w:t>
             </w:r>
-            <w:proofErr w:type="spellEnd"/>
           </w:p>
         </w:tc>
         <w:tc>
@@ -10416,13 +9978,8 @@
             <w:pPr>
               <w:jc w:val="center"/>
             </w:pPr>
-            <w:proofErr w:type="gramStart"/>
-            <w:r>
-              <w:t>NUMERIC(</w:t>
-            </w:r>
-            <w:proofErr w:type="gramEnd"/>
-            <w:r>
-              <w:t>5,2)</w:t>
+            <w:r>
+              <w:t>NUMERIC(5,2)</w:t>
             </w:r>
           </w:p>
         </w:tc>
@@ -10602,12 +10159,10 @@
             <w:pPr>
               <w:jc w:val="center"/>
             </w:pPr>
-            <w:proofErr w:type="spellStart"/>
             <w:r>
               <w:lastRenderedPageBreak/>
               <w:t>fecha_registro</w:t>
             </w:r>
-            <w:proofErr w:type="spellEnd"/>
           </w:p>
         </w:tc>
         <w:tc>
@@ -10682,20 +10237,7 @@
               <w:jc w:val="center"/>
             </w:pPr>
             <w:r>
-              <w:t xml:space="preserve">Fecha de registro. Default: </w:t>
-            </w:r>
-            <w:proofErr w:type="spellStart"/>
-            <w:proofErr w:type="gramStart"/>
-            <w:r>
-              <w:t>now</w:t>
-            </w:r>
-            <w:proofErr w:type="spellEnd"/>
-            <w:r>
-              <w:t>(</w:t>
-            </w:r>
-            <w:proofErr w:type="gramEnd"/>
-            <w:r>
-              <w:t>)</w:t>
+              <w:t>Fecha de registro. Default: now()</w:t>
             </w:r>
           </w:p>
         </w:tc>
@@ -10742,13 +10284,8 @@
         </w:numPr>
         <w:spacing w:before="240" w:after="0"/>
       </w:pPr>
-      <w:proofErr w:type="spellStart"/>
       <w:r>
-        <w:t>potencia_promedio_w</w:t>
-      </w:r>
-      <w:proofErr w:type="spellEnd"/>
-      <w:r>
-        <w:t xml:space="preserve"> &gt;= 0</w:t>
+        <w:t>potencia_promedio_w &gt;= 0</w:t>
       </w:r>
     </w:p>
     <w:p>
@@ -10759,21 +10296,8 @@
         </w:numPr>
         <w:spacing w:after="240"/>
       </w:pPr>
-      <w:proofErr w:type="spellStart"/>
       <w:r>
-        <w:t>horas_uso_diario</w:t>
-      </w:r>
-      <w:proofErr w:type="spellEnd"/>
-      <w:r>
-        <w:t xml:space="preserve"> &gt;= 0 AND </w:t>
-      </w:r>
-      <w:proofErr w:type="spellStart"/>
-      <w:r>
-        <w:t>horas_uso_diario</w:t>
-      </w:r>
-      <w:proofErr w:type="spellEnd"/>
-      <w:r>
-        <w:t xml:space="preserve"> &lt;= 24</w:t>
+        <w:t>horas_uso_diario &gt;= 0 AND horas_uso_diario &lt;= 24</w:t>
       </w:r>
     </w:p>
     <w:p>
@@ -10801,17 +10325,8 @@
           <w:sz w:val="34"/>
           <w:szCs w:val="34"/>
         </w:rPr>
-        <w:t xml:space="preserve">TABLA: </w:t>
+        <w:t>TABLA: registros_consumo</w:t>
       </w:r>
-      <w:proofErr w:type="spellStart"/>
-      <w:r>
-        <w:rPr>
-          <w:sz w:val="34"/>
-          <w:szCs w:val="34"/>
-        </w:rPr>
-        <w:t>registros_consumo</w:t>
-      </w:r>
-      <w:proofErr w:type="spellEnd"/>
     </w:p>
     <w:p>
       <w:pPr>
@@ -11103,13 +10618,8 @@
               <w:jc w:val="center"/>
             </w:pPr>
             <w:r>
-              <w:t xml:space="preserve">Identificador único </w:t>
-            </w:r>
-            <w:proofErr w:type="spellStart"/>
-            <w:r>
-              <w:t>auto-incremental</w:t>
-            </w:r>
-            <w:proofErr w:type="spellEnd"/>
+              <w:t>Identificador único auto-incremental</w:t>
+            </w:r>
           </w:p>
         </w:tc>
         <w:tc>
@@ -11150,11 +10660,9 @@
             <w:pPr>
               <w:jc w:val="center"/>
             </w:pPr>
-            <w:proofErr w:type="spellStart"/>
             <w:r>
               <w:t>usuario_id</w:t>
             </w:r>
-            <w:proofErr w:type="spellEnd"/>
           </w:p>
         </w:tc>
         <w:tc>
@@ -11390,11 +10898,9 @@
             <w:pPr>
               <w:jc w:val="center"/>
             </w:pPr>
-            <w:proofErr w:type="spellStart"/>
             <w:r>
               <w:t>consumo_kwh</w:t>
             </w:r>
-            <w:proofErr w:type="spellEnd"/>
           </w:p>
         </w:tc>
         <w:tc>
@@ -11449,13 +10955,8 @@
             <w:pPr>
               <w:jc w:val="center"/>
             </w:pPr>
-            <w:proofErr w:type="gramStart"/>
-            <w:r>
-              <w:t>NUMERIC(</w:t>
-            </w:r>
-            <w:proofErr w:type="gramEnd"/>
-            <w:r>
-              <w:t>12,4)</w:t>
+            <w:r>
+              <w:t>NUMERIC(12,4)</w:t>
             </w:r>
           </w:p>
         </w:tc>
@@ -11516,11 +11017,9 @@
             <w:pPr>
               <w:jc w:val="center"/>
             </w:pPr>
-            <w:proofErr w:type="spellStart"/>
             <w:r>
               <w:t>costo_clp</w:t>
             </w:r>
-            <w:proofErr w:type="spellEnd"/>
           </w:p>
         </w:tc>
         <w:tc>
@@ -11575,13 +11074,8 @@
             <w:pPr>
               <w:jc w:val="center"/>
             </w:pPr>
-            <w:proofErr w:type="gramStart"/>
-            <w:r>
-              <w:t>NUMERIC(</w:t>
-            </w:r>
-            <w:proofErr w:type="gramEnd"/>
-            <w:r>
-              <w:t>14,2)</w:t>
+            <w:r>
+              <w:t>NUMERIC(14,2)</w:t>
             </w:r>
           </w:p>
         </w:tc>
@@ -11642,12 +11136,10 @@
             <w:pPr>
               <w:jc w:val="center"/>
             </w:pPr>
-            <w:proofErr w:type="spellStart"/>
             <w:r>
               <w:lastRenderedPageBreak/>
               <w:t>dispositivo_id</w:t>
             </w:r>
-            <w:proofErr w:type="spellEnd"/>
           </w:p>
         </w:tc>
         <w:tc>
@@ -11821,11 +11313,9 @@
             <w:pPr>
               <w:jc w:val="center"/>
             </w:pPr>
-            <w:proofErr w:type="spellStart"/>
             <w:r>
               <w:t>fuente_lectura</w:t>
             </w:r>
-            <w:proofErr w:type="spellEnd"/>
           </w:p>
         </w:tc>
         <w:tc>
@@ -11843,15 +11333,7 @@
               <w:jc w:val="center"/>
             </w:pPr>
             <w:r>
-              <w:t>Origen: 'manual' o '</w:t>
-            </w:r>
-            <w:proofErr w:type="spellStart"/>
-            <w:r>
-              <w:t>automatica</w:t>
-            </w:r>
-            <w:proofErr w:type="spellEnd"/>
-            <w:r>
-              <w:t>'. Default: 'manual'</w:t>
+              <w:t>Origen: 'manual' o 'automatica'. Default: 'manual'</w:t>
             </w:r>
           </w:p>
         </w:tc>
@@ -11893,11 +11375,9 @@
             <w:pPr>
               <w:jc w:val="center"/>
             </w:pPr>
-            <w:proofErr w:type="spellStart"/>
             <w:r>
               <w:t>creado_en</w:t>
             </w:r>
-            <w:proofErr w:type="spellEnd"/>
           </w:p>
         </w:tc>
         <w:tc>
@@ -11972,20 +11452,7 @@
               <w:jc w:val="center"/>
             </w:pPr>
             <w:r>
-              <w:t xml:space="preserve">Fecha de creación del registro. Default: </w:t>
-            </w:r>
-            <w:proofErr w:type="spellStart"/>
-            <w:proofErr w:type="gramStart"/>
-            <w:r>
-              <w:t>now</w:t>
-            </w:r>
-            <w:proofErr w:type="spellEnd"/>
-            <w:r>
-              <w:t>(</w:t>
-            </w:r>
-            <w:proofErr w:type="gramEnd"/>
-            <w:r>
-              <w:t>)</w:t>
+              <w:t>Fecha de creación del registro. Default: now()</w:t>
             </w:r>
           </w:p>
         </w:tc>
@@ -12032,13 +11499,8 @@
         </w:numPr>
         <w:spacing w:before="240" w:after="0"/>
       </w:pPr>
-      <w:proofErr w:type="spellStart"/>
       <w:r>
-        <w:t>consumo_kwh</w:t>
-      </w:r>
-      <w:proofErr w:type="spellEnd"/>
-      <w:r>
-        <w:t xml:space="preserve"> &gt;= 0</w:t>
+        <w:t>consumo_kwh &gt;= 0</w:t>
       </w:r>
     </w:p>
     <w:p>
@@ -12049,13 +11511,8 @@
         </w:numPr>
         <w:spacing w:after="0"/>
       </w:pPr>
-      <w:proofErr w:type="spellStart"/>
       <w:r>
-        <w:t>costo_clp</w:t>
-      </w:r>
-      <w:proofErr w:type="spellEnd"/>
-      <w:r>
-        <w:t xml:space="preserve"> &gt;= 0 (si no es NULL)</w:t>
+        <w:t>costo_clp &gt;= 0 (si no es NULL)</w:t>
       </w:r>
     </w:p>
     <w:p>
@@ -12093,23 +11550,7 @@
         <w:spacing w:before="240" w:after="240"/>
       </w:pPr>
       <w:r>
-        <w:t>Combinación única de (</w:t>
-      </w:r>
-      <w:proofErr w:type="spellStart"/>
-      <w:r>
-        <w:t>usuario_id</w:t>
-      </w:r>
-      <w:proofErr w:type="spellEnd"/>
-      <w:r>
-        <w:t xml:space="preserve">, fecha, </w:t>
-      </w:r>
-      <w:proofErr w:type="spellStart"/>
-      <w:r>
-        <w:t>dispositivo_id</w:t>
-      </w:r>
-      <w:proofErr w:type="spellEnd"/>
-      <w:r>
-        <w:t>)</w:t>
+        <w:t>Combinación única de (usuario_id, fecha, dispositivo_id)</w:t>
       </w:r>
     </w:p>
     <w:p>
@@ -12137,17 +11578,8 @@
           <w:sz w:val="34"/>
           <w:szCs w:val="34"/>
         </w:rPr>
-        <w:t xml:space="preserve">TABLA: </w:t>
+        <w:t>TABLA: predicciones_consumo</w:t>
       </w:r>
-      <w:proofErr w:type="spellStart"/>
-      <w:r>
-        <w:rPr>
-          <w:sz w:val="34"/>
-          <w:szCs w:val="34"/>
-        </w:rPr>
-        <w:t>predicciones_consumo</w:t>
-      </w:r>
-      <w:proofErr w:type="spellEnd"/>
     </w:p>
     <w:p>
       <w:pPr>
@@ -12439,13 +11871,8 @@
               <w:jc w:val="center"/>
             </w:pPr>
             <w:r>
-              <w:t xml:space="preserve">Identificador único </w:t>
-            </w:r>
-            <w:proofErr w:type="spellStart"/>
-            <w:r>
-              <w:t>auto-incremental</w:t>
-            </w:r>
-            <w:proofErr w:type="spellEnd"/>
+              <w:t>Identificador único auto-incremental</w:t>
+            </w:r>
           </w:p>
         </w:tc>
         <w:tc>
@@ -12486,12 +11913,10 @@
             <w:pPr>
               <w:jc w:val="center"/>
             </w:pPr>
-            <w:proofErr w:type="spellStart"/>
             <w:r>
               <w:lastRenderedPageBreak/>
               <w:t>usuario_id</w:t>
             </w:r>
-            <w:proofErr w:type="spellEnd"/>
           </w:p>
         </w:tc>
         <w:tc>
@@ -12608,11 +12033,9 @@
             <w:pPr>
               <w:jc w:val="center"/>
             </w:pPr>
-            <w:proofErr w:type="spellStart"/>
             <w:r>
               <w:t>fecha_prediccion</w:t>
             </w:r>
-            <w:proofErr w:type="spellEnd"/>
           </w:p>
         </w:tc>
         <w:tc>
@@ -12729,11 +12152,9 @@
             <w:pPr>
               <w:jc w:val="center"/>
             </w:pPr>
-            <w:proofErr w:type="spellStart"/>
             <w:r>
               <w:t>periodo_inicio</w:t>
             </w:r>
-            <w:proofErr w:type="spellEnd"/>
           </w:p>
         </w:tc>
         <w:tc>
@@ -12850,11 +12271,9 @@
             <w:pPr>
               <w:jc w:val="center"/>
             </w:pPr>
-            <w:proofErr w:type="spellStart"/>
             <w:r>
               <w:t>periodo_fin</w:t>
             </w:r>
-            <w:proofErr w:type="spellEnd"/>
           </w:p>
         </w:tc>
         <w:tc>
@@ -12971,11 +12390,9 @@
             <w:pPr>
               <w:jc w:val="center"/>
             </w:pPr>
-            <w:proofErr w:type="spellStart"/>
             <w:r>
               <w:t>consumo_predicho_kwh</w:t>
             </w:r>
-            <w:proofErr w:type="spellEnd"/>
           </w:p>
         </w:tc>
         <w:tc>
@@ -13030,13 +12447,8 @@
             <w:pPr>
               <w:jc w:val="center"/>
             </w:pPr>
-            <w:proofErr w:type="gramStart"/>
-            <w:r>
-              <w:t>NUMERIC(</w:t>
-            </w:r>
-            <w:proofErr w:type="gramEnd"/>
-            <w:r>
-              <w:t>12,4)</w:t>
+            <w:r>
+              <w:t>NUMERIC(12,4)</w:t>
             </w:r>
           </w:p>
         </w:tc>
@@ -13097,11 +12509,9 @@
             <w:pPr>
               <w:jc w:val="center"/>
             </w:pPr>
-            <w:proofErr w:type="spellStart"/>
             <w:r>
               <w:t>nivel_alerta_id</w:t>
             </w:r>
-            <w:proofErr w:type="spellEnd"/>
           </w:p>
         </w:tc>
         <w:tc>
@@ -13176,15 +12586,7 @@
               <w:jc w:val="center"/>
             </w:pPr>
             <w:r>
-              <w:t xml:space="preserve">Referencia a </w:t>
-            </w:r>
-            <w:proofErr w:type="spellStart"/>
-            <w:r>
-              <w:t>cat_nivel_alerta</w:t>
-            </w:r>
-            <w:proofErr w:type="spellEnd"/>
-            <w:r>
-              <w:t>(id)</w:t>
+              <w:t>Referencia a cat_nivel_alerta(id)</w:t>
             </w:r>
           </w:p>
         </w:tc>
@@ -13226,11 +12628,9 @@
             <w:pPr>
               <w:jc w:val="center"/>
             </w:pPr>
-            <w:proofErr w:type="spellStart"/>
             <w:r>
               <w:t>creado_en</w:t>
             </w:r>
-            <w:proofErr w:type="spellEnd"/>
           </w:p>
         </w:tc>
         <w:tc>
@@ -13305,20 +12705,7 @@
               <w:jc w:val="center"/>
             </w:pPr>
             <w:r>
-              <w:t xml:space="preserve">Fecha de creación. Default: </w:t>
-            </w:r>
-            <w:proofErr w:type="spellStart"/>
-            <w:proofErr w:type="gramStart"/>
-            <w:r>
-              <w:t>now</w:t>
-            </w:r>
-            <w:proofErr w:type="spellEnd"/>
-            <w:r>
-              <w:t>(</w:t>
-            </w:r>
-            <w:proofErr w:type="gramEnd"/>
-            <w:r>
-              <w:t>)</w:t>
+              <w:t>Fecha de creación. Default: now()</w:t>
             </w:r>
           </w:p>
         </w:tc>
@@ -13365,13 +12752,8 @@
         </w:numPr>
         <w:spacing w:before="240" w:after="0"/>
       </w:pPr>
-      <w:proofErr w:type="spellStart"/>
       <w:r>
-        <w:t>consumo_predicho_kwh</w:t>
-      </w:r>
-      <w:proofErr w:type="spellEnd"/>
-      <w:r>
-        <w:t xml:space="preserve"> &gt;= 0</w:t>
+        <w:t>consumo_predicho_kwh &gt;= 0</w:t>
       </w:r>
     </w:p>
     <w:p>
@@ -13382,19 +12764,9 @@
         </w:numPr>
         <w:spacing w:after="240"/>
       </w:pPr>
-      <w:proofErr w:type="spellStart"/>
       <w:r>
-        <w:t>periodo_fin</w:t>
+        <w:t>periodo_fin &gt;= periodo_inicio</w:t>
       </w:r>
-      <w:proofErr w:type="spellEnd"/>
-      <w:r>
-        <w:t xml:space="preserve"> &gt;= </w:t>
-      </w:r>
-      <w:proofErr w:type="spellStart"/>
-      <w:r>
-        <w:t>periodo_inicio</w:t>
-      </w:r>
-      <w:proofErr w:type="spellEnd"/>
     </w:p>
     <w:p>
       <w:pPr>
@@ -13715,13 +13087,8 @@
               <w:jc w:val="center"/>
             </w:pPr>
             <w:r>
-              <w:t xml:space="preserve">Identificador único </w:t>
-            </w:r>
-            <w:proofErr w:type="spellStart"/>
-            <w:r>
-              <w:t>auto-incremental</w:t>
-            </w:r>
-            <w:proofErr w:type="spellEnd"/>
+              <w:t>Identificador único auto-incremental</w:t>
+            </w:r>
           </w:p>
         </w:tc>
         <w:tc>
@@ -13762,11 +13129,9 @@
             <w:pPr>
               <w:jc w:val="center"/>
             </w:pPr>
-            <w:proofErr w:type="spellStart"/>
             <w:r>
               <w:t>usuario_id</w:t>
             </w:r>
-            <w:proofErr w:type="spellEnd"/>
           </w:p>
         </w:tc>
         <w:tc>
@@ -13883,11 +13248,9 @@
             <w:pPr>
               <w:jc w:val="center"/>
             </w:pPr>
-            <w:proofErr w:type="spellStart"/>
             <w:r>
               <w:t>tipo_id</w:t>
             </w:r>
-            <w:proofErr w:type="spellEnd"/>
           </w:p>
         </w:tc>
         <w:tc>
@@ -13962,15 +13325,7 @@
               <w:jc w:val="center"/>
             </w:pPr>
             <w:r>
-              <w:t xml:space="preserve">Referencia a </w:t>
-            </w:r>
-            <w:proofErr w:type="spellStart"/>
-            <w:r>
-              <w:t>cat_tipo_notificacion</w:t>
-            </w:r>
-            <w:proofErr w:type="spellEnd"/>
-            <w:r>
-              <w:t>(id)</w:t>
+              <w:t>Referencia a cat_tipo_notificacion(id)</w:t>
             </w:r>
           </w:p>
         </w:tc>
@@ -14250,11 +13605,9 @@
             <w:pPr>
               <w:jc w:val="center"/>
             </w:pPr>
-            <w:proofErr w:type="spellStart"/>
             <w:r>
               <w:t>leida</w:t>
             </w:r>
-            <w:proofErr w:type="spellEnd"/>
           </w:p>
         </w:tc>
         <w:tc>
@@ -14371,11 +13724,9 @@
             <w:pPr>
               <w:jc w:val="center"/>
             </w:pPr>
-            <w:proofErr w:type="spellStart"/>
             <w:r>
               <w:t>creada_en</w:t>
             </w:r>
-            <w:proofErr w:type="spellEnd"/>
           </w:p>
         </w:tc>
         <w:tc>
@@ -14450,20 +13801,7 @@
               <w:jc w:val="center"/>
             </w:pPr>
             <w:r>
-              <w:t xml:space="preserve">Fecha de creación. Default: </w:t>
-            </w:r>
-            <w:proofErr w:type="spellStart"/>
-            <w:proofErr w:type="gramStart"/>
-            <w:r>
-              <w:t>now</w:t>
-            </w:r>
-            <w:proofErr w:type="spellEnd"/>
-            <w:r>
-              <w:t>(</w:t>
-            </w:r>
-            <w:proofErr w:type="gramEnd"/>
-            <w:r>
-              <w:t>)</w:t>
+              <w:t>Fecha de creación. Default: now()</w:t>
             </w:r>
           </w:p>
         </w:tc>
@@ -14511,23 +13849,7 @@
         <w:spacing w:before="240" w:after="240"/>
       </w:pPr>
       <w:r>
-        <w:t>Mensaje no puede estar vacío (</w:t>
-      </w:r>
-      <w:proofErr w:type="spellStart"/>
-      <w:r>
-        <w:t>length</w:t>
-      </w:r>
-      <w:proofErr w:type="spellEnd"/>
-      <w:r>
-        <w:t>(</w:t>
-      </w:r>
-      <w:proofErr w:type="spellStart"/>
-      <w:r>
-        <w:t>trim</w:t>
-      </w:r>
-      <w:proofErr w:type="spellEnd"/>
-      <w:r>
-        <w:t>(mensaje)) &gt; 0)</w:t>
+        <w:t>Mensaje no puede estar vacío (length(trim(mensaje)) &gt; 0)</w:t>
       </w:r>
     </w:p>
     <w:p>
@@ -14555,17 +13877,8 @@
           <w:sz w:val="34"/>
           <w:szCs w:val="34"/>
         </w:rPr>
-        <w:t xml:space="preserve">TABLA: </w:t>
+        <w:t>TABLA: metricas_mensuales</w:t>
       </w:r>
-      <w:proofErr w:type="spellStart"/>
-      <w:r>
-        <w:rPr>
-          <w:sz w:val="34"/>
-          <w:szCs w:val="34"/>
-        </w:rPr>
-        <w:t>metricas_mensuales</w:t>
-      </w:r>
-      <w:proofErr w:type="spellEnd"/>
     </w:p>
     <w:p>
       <w:pPr>
@@ -14861,13 +14174,8 @@
               <w:jc w:val="center"/>
             </w:pPr>
             <w:r>
-              <w:t xml:space="preserve">Identificador único </w:t>
-            </w:r>
-            <w:proofErr w:type="spellStart"/>
-            <w:r>
-              <w:t>auto-incremental</w:t>
-            </w:r>
-            <w:proofErr w:type="spellEnd"/>
+              <w:t>Identificador único auto-incremental</w:t>
+            </w:r>
           </w:p>
         </w:tc>
         <w:tc>
@@ -14909,11 +14217,9 @@
             <w:pPr>
               <w:jc w:val="center"/>
             </w:pPr>
-            <w:proofErr w:type="spellStart"/>
             <w:r>
               <w:t>usuario_id</w:t>
             </w:r>
-            <w:proofErr w:type="spellEnd"/>
           </w:p>
         </w:tc>
         <w:tc>
@@ -15031,11 +14337,9 @@
             <w:pPr>
               <w:jc w:val="center"/>
             </w:pPr>
-            <w:proofErr w:type="spellStart"/>
             <w:r>
               <w:t>periodo_mes</w:t>
             </w:r>
-            <w:proofErr w:type="spellEnd"/>
           </w:p>
         </w:tc>
         <w:tc>
@@ -15153,11 +14457,9 @@
             <w:pPr>
               <w:jc w:val="center"/>
             </w:pPr>
-            <w:proofErr w:type="spellStart"/>
             <w:r>
               <w:t>consumo_kwh</w:t>
             </w:r>
-            <w:proofErr w:type="spellEnd"/>
           </w:p>
         </w:tc>
         <w:tc>
@@ -15212,13 +14514,8 @@
             <w:pPr>
               <w:jc w:val="center"/>
             </w:pPr>
-            <w:proofErr w:type="gramStart"/>
-            <w:r>
-              <w:t>NUMERIC(</w:t>
-            </w:r>
-            <w:proofErr w:type="gramEnd"/>
-            <w:r>
-              <w:t>14,4)</w:t>
+            <w:r>
+              <w:t>NUMERIC(14,4)</w:t>
             </w:r>
           </w:p>
         </w:tc>
@@ -15280,11 +14577,9 @@
             <w:pPr>
               <w:jc w:val="center"/>
             </w:pPr>
-            <w:proofErr w:type="spellStart"/>
             <w:r>
               <w:t>ahorro_clp</w:t>
             </w:r>
-            <w:proofErr w:type="spellEnd"/>
           </w:p>
         </w:tc>
         <w:tc>
@@ -15339,13 +14634,8 @@
             <w:pPr>
               <w:jc w:val="center"/>
             </w:pPr>
-            <w:proofErr w:type="gramStart"/>
-            <w:r>
-              <w:t>NUMERIC(</w:t>
-            </w:r>
-            <w:proofErr w:type="gramEnd"/>
-            <w:r>
-              <w:t>14,2)</w:t>
+            <w:r>
+              <w:t>NUMERIC(14,2)</w:t>
             </w:r>
           </w:p>
         </w:tc>
@@ -15464,13 +14754,8 @@
             <w:pPr>
               <w:jc w:val="center"/>
             </w:pPr>
-            <w:proofErr w:type="gramStart"/>
-            <w:r>
-              <w:t>NUMERIC(</w:t>
-            </w:r>
-            <w:proofErr w:type="gramEnd"/>
-            <w:r>
-              <w:t>14,3)</w:t>
+            <w:r>
+              <w:t>NUMERIC(14,3)</w:t>
             </w:r>
           </w:p>
         </w:tc>
@@ -15532,11 +14817,9 @@
             <w:pPr>
               <w:jc w:val="center"/>
             </w:pPr>
-            <w:proofErr w:type="spellStart"/>
             <w:r>
               <w:t>comparacion_mes_anterior_pct</w:t>
             </w:r>
-            <w:proofErr w:type="spellEnd"/>
           </w:p>
         </w:tc>
         <w:tc>
@@ -15591,13 +14874,8 @@
             <w:pPr>
               <w:jc w:val="center"/>
             </w:pPr>
-            <w:proofErr w:type="gramStart"/>
-            <w:r>
-              <w:t>NUMERIC(</w:t>
-            </w:r>
-            <w:proofErr w:type="gramEnd"/>
-            <w:r>
-              <w:t>6,2)</w:t>
+            <w:r>
+              <w:t>NUMERIC(6,2)</w:t>
             </w:r>
           </w:p>
         </w:tc>
@@ -15659,12 +14937,10 @@
             <w:pPr>
               <w:jc w:val="center"/>
             </w:pPr>
-            <w:proofErr w:type="spellStart"/>
             <w:r>
               <w:lastRenderedPageBreak/>
               <w:t>calculado_en</w:t>
             </w:r>
-            <w:proofErr w:type="spellEnd"/>
           </w:p>
         </w:tc>
         <w:tc>
@@ -15739,20 +15015,7 @@
               <w:jc w:val="center"/>
             </w:pPr>
             <w:r>
-              <w:t xml:space="preserve">Fecha del cálculo. Default: </w:t>
-            </w:r>
-            <w:proofErr w:type="spellStart"/>
-            <w:proofErr w:type="gramStart"/>
-            <w:r>
-              <w:t>now</w:t>
-            </w:r>
-            <w:proofErr w:type="spellEnd"/>
-            <w:r>
-              <w:t>(</w:t>
-            </w:r>
-            <w:proofErr w:type="gramEnd"/>
-            <w:r>
-              <w:t>)</w:t>
+              <w:t>Fecha del cálculo. Default: now()</w:t>
             </w:r>
           </w:p>
         </w:tc>
@@ -15799,13 +15062,8 @@
         </w:numPr>
         <w:spacing w:before="240" w:after="0"/>
       </w:pPr>
-      <w:proofErr w:type="spellStart"/>
       <w:r>
-        <w:t>consumo_kwh</w:t>
-      </w:r>
-      <w:proofErr w:type="spellEnd"/>
-      <w:r>
-        <w:t xml:space="preserve"> &gt;= 0</w:t>
+        <w:t>consumo_kwh &gt;= 0</w:t>
       </w:r>
     </w:p>
     <w:p>
@@ -15816,13 +15074,8 @@
         </w:numPr>
         <w:spacing w:after="0"/>
       </w:pPr>
-      <w:proofErr w:type="spellStart"/>
       <w:r>
-        <w:t>ahorro_clp</w:t>
-      </w:r>
-      <w:proofErr w:type="spellEnd"/>
-      <w:r>
-        <w:t xml:space="preserve"> &gt;= 0 (si no es NULL)</w:t>
+        <w:t>ahorro_clp &gt;= 0 (si no es NULL)</w:t>
       </w:r>
     </w:p>
     <w:p>
@@ -15845,13 +15098,8 @@
         </w:numPr>
         <w:spacing w:after="240"/>
       </w:pPr>
-      <w:proofErr w:type="spellStart"/>
       <w:r>
-        <w:t>periodo_mes</w:t>
-      </w:r>
-      <w:proofErr w:type="spellEnd"/>
-      <w:r>
-        <w:t xml:space="preserve"> debe ser el día 1 del mes</w:t>
+        <w:t>periodo_mes debe ser el día 1 del mes</w:t>
       </w:r>
     </w:p>
     <w:p>
@@ -15877,23 +15125,7 @@
         <w:spacing w:before="240" w:after="240"/>
       </w:pPr>
       <w:r>
-        <w:t>Combinación única de (</w:t>
-      </w:r>
-      <w:proofErr w:type="spellStart"/>
-      <w:r>
-        <w:t>usuario_id</w:t>
-      </w:r>
-      <w:proofErr w:type="spellEnd"/>
-      <w:r>
-        <w:t xml:space="preserve">, </w:t>
-      </w:r>
-      <w:proofErr w:type="spellStart"/>
-      <w:r>
-        <w:t>periodo_mes</w:t>
-      </w:r>
-      <w:proofErr w:type="spellEnd"/>
-      <w:r>
-        <w:t>)</w:t>
+        <w:t>Combinación única de (usuario_id, periodo_mes)</w:t>
       </w:r>
     </w:p>
     <w:p>
@@ -15921,17 +15153,8 @@
           <w:sz w:val="34"/>
           <w:szCs w:val="34"/>
         </w:rPr>
-        <w:t xml:space="preserve">TABLA: </w:t>
+        <w:t>TABLA: auditoria_eventos</w:t>
       </w:r>
-      <w:proofErr w:type="spellStart"/>
-      <w:r>
-        <w:rPr>
-          <w:sz w:val="34"/>
-          <w:szCs w:val="34"/>
-        </w:rPr>
-        <w:t>auditoria_eventos</w:t>
-      </w:r>
-      <w:proofErr w:type="spellEnd"/>
     </w:p>
     <w:p>
       <w:pPr>
@@ -16223,13 +15446,8 @@
               <w:jc w:val="center"/>
             </w:pPr>
             <w:r>
-              <w:t xml:space="preserve">Identificador único </w:t>
-            </w:r>
-            <w:proofErr w:type="spellStart"/>
-            <w:r>
-              <w:t>auto-incremental</w:t>
-            </w:r>
-            <w:proofErr w:type="spellEnd"/>
+              <w:t>Identificador único auto-incremental</w:t>
+            </w:r>
           </w:p>
         </w:tc>
         <w:tc>
@@ -16270,11 +15488,9 @@
             <w:pPr>
               <w:jc w:val="center"/>
             </w:pPr>
-            <w:proofErr w:type="spellStart"/>
             <w:r>
               <w:t>usuario_id</w:t>
             </w:r>
-            <w:proofErr w:type="spellEnd"/>
           </w:p>
         </w:tc>
         <w:tc>
@@ -16510,11 +15726,9 @@
             <w:pPr>
               <w:jc w:val="center"/>
             </w:pPr>
-            <w:proofErr w:type="spellStart"/>
             <w:r>
               <w:t>entidad_id</w:t>
             </w:r>
-            <w:proofErr w:type="spellEnd"/>
           </w:p>
         </w:tc>
         <w:tc>
@@ -16631,12 +15845,10 @@
             <w:pPr>
               <w:jc w:val="center"/>
             </w:pPr>
-            <w:proofErr w:type="spellStart"/>
             <w:r>
               <w:lastRenderedPageBreak/>
-              <w:t>accion</w:t>
-            </w:r>
-            <w:proofErr w:type="spellEnd"/>
+              <w:t>acción</w:t>
+            </w:r>
           </w:p>
         </w:tc>
         <w:tc>
@@ -16872,11 +16084,9 @@
             <w:pPr>
               <w:jc w:val="center"/>
             </w:pPr>
-            <w:proofErr w:type="spellStart"/>
             <w:r>
               <w:t>ip</w:t>
             </w:r>
-            <w:proofErr w:type="spellEnd"/>
           </w:p>
         </w:tc>
         <w:tc>
@@ -16993,11 +16203,9 @@
             <w:pPr>
               <w:jc w:val="center"/>
             </w:pPr>
-            <w:proofErr w:type="spellStart"/>
             <w:r>
               <w:t>user_agent</w:t>
             </w:r>
-            <w:proofErr w:type="spellEnd"/>
           </w:p>
         </w:tc>
         <w:tc>
@@ -17071,21 +16279,8 @@
             <w:pPr>
               <w:jc w:val="center"/>
             </w:pPr>
-            <w:proofErr w:type="spellStart"/>
-            <w:r>
-              <w:t>User</w:t>
-            </w:r>
-            <w:proofErr w:type="spellEnd"/>
-            <w:r>
-              <w:t xml:space="preserve"> </w:t>
-            </w:r>
-            <w:proofErr w:type="spellStart"/>
-            <w:r>
-              <w:t>agent</w:t>
-            </w:r>
-            <w:proofErr w:type="spellEnd"/>
-            <w:r>
-              <w:t xml:space="preserve"> del navegador</w:t>
+            <w:r>
+              <w:t>User agent del navegador</w:t>
             </w:r>
           </w:p>
         </w:tc>
@@ -17127,11 +16322,9 @@
             <w:pPr>
               <w:jc w:val="center"/>
             </w:pPr>
-            <w:proofErr w:type="spellStart"/>
             <w:r>
               <w:t>ocurrido_en</w:t>
             </w:r>
-            <w:proofErr w:type="spellEnd"/>
           </w:p>
         </w:tc>
         <w:tc>
@@ -17206,20 +16399,7 @@
               <w:jc w:val="center"/>
             </w:pPr>
             <w:r>
-              <w:t xml:space="preserve">Fecha y hora del evento. Default: </w:t>
-            </w:r>
-            <w:proofErr w:type="spellStart"/>
-            <w:proofErr w:type="gramStart"/>
-            <w:r>
-              <w:t>now</w:t>
-            </w:r>
-            <w:proofErr w:type="spellEnd"/>
-            <w:r>
-              <w:t>(</w:t>
-            </w:r>
-            <w:proofErr w:type="gramEnd"/>
-            <w:r>
-              <w:t>)</w:t>
+              <w:t>Fecha y hora del evento. Default: now()</w:t>
             </w:r>
           </w:p>
         </w:tc>
@@ -17300,38 +16480,14 @@
         </w:numPr>
         <w:spacing w:before="240" w:after="0"/>
       </w:pPr>
-      <w:proofErr w:type="spellStart"/>
       <w:r>
         <w:rPr>
           <w:b/>
         </w:rPr>
-        <w:t>auth_</w:t>
+        <w:t>auth_identidades.usuario_id</w:t>
       </w:r>
-      <w:proofErr w:type="gramStart"/>
       <w:r>
-        <w:rPr>
-          <w:b/>
-        </w:rPr>
-        <w:t>identidades.usuario</w:t>
-      </w:r>
-      <w:proofErr w:type="gramEnd"/>
-      <w:r>
-        <w:rPr>
-          <w:b/>
-        </w:rPr>
-        <w:t>_id</w:t>
-      </w:r>
-      <w:proofErr w:type="spellEnd"/>
-      <w:r>
-        <w:t xml:space="preserve"> → </w:t>
-      </w:r>
-      <w:proofErr w:type="spellStart"/>
-      <w:r>
-        <w:t>usuarios.id</w:t>
-      </w:r>
-      <w:proofErr w:type="spellEnd"/>
-      <w:r>
-        <w:t xml:space="preserve"> (ON DELETE CASCADE)</w:t>
+        <w:t xml:space="preserve"> → usuarios.id (ON DELETE CASCADE)</w:t>
       </w:r>
     </w:p>
     <w:p>
@@ -17342,32 +16498,14 @@
         </w:numPr>
         <w:spacing w:after="0"/>
       </w:pPr>
-      <w:proofErr w:type="spellStart"/>
-      <w:proofErr w:type="gramStart"/>
       <w:r>
         <w:rPr>
           <w:b/>
         </w:rPr>
-        <w:t>perfiles.usuario</w:t>
+        <w:t>perfiles.usuario_id</w:t>
       </w:r>
-      <w:proofErr w:type="gramEnd"/>
       <w:r>
-        <w:rPr>
-          <w:b/>
-        </w:rPr>
-        <w:t>_id</w:t>
-      </w:r>
-      <w:proofErr w:type="spellEnd"/>
-      <w:r>
-        <w:t xml:space="preserve"> → </w:t>
-      </w:r>
-      <w:proofErr w:type="spellStart"/>
-      <w:r>
-        <w:t>usuarios.id</w:t>
-      </w:r>
-      <w:proofErr w:type="spellEnd"/>
-      <w:r>
-        <w:t xml:space="preserve"> (ON DELETE CASCADE)</w:t>
+        <w:t xml:space="preserve"> → usuarios.id (ON DELETE CASCADE)</w:t>
       </w:r>
     </w:p>
     <w:p>
@@ -17378,30 +16516,15 @@
         </w:numPr>
         <w:spacing w:after="0"/>
       </w:pPr>
-      <w:proofErr w:type="spellStart"/>
-      <w:proofErr w:type="gramStart"/>
       <w:r>
         <w:rPr>
           <w:b/>
         </w:rPr>
-        <w:t>perfiles.tipo</w:t>
+        <w:t>perfiles.tipo_vivienda_id</w:t>
       </w:r>
-      <w:proofErr w:type="gramEnd"/>
       <w:r>
-        <w:rPr>
-          <w:b/>
-        </w:rPr>
-        <w:t>_vivienda_id</w:t>
+        <w:t xml:space="preserve"> → cat_tipo_vivienda.id</w:t>
       </w:r>
-      <w:proofErr w:type="spellEnd"/>
-      <w:r>
-        <w:t xml:space="preserve"> → </w:t>
-      </w:r>
-      <w:proofErr w:type="spellStart"/>
-      <w:r>
-        <w:t>cat_tipo_vivienda.id</w:t>
-      </w:r>
-      <w:proofErr w:type="spellEnd"/>
     </w:p>
     <w:p>
       <w:pPr>
@@ -17411,32 +16534,14 @@
         </w:numPr>
         <w:spacing w:after="0"/>
       </w:pPr>
-      <w:proofErr w:type="spellStart"/>
-      <w:proofErr w:type="gramStart"/>
       <w:r>
         <w:rPr>
           <w:b/>
         </w:rPr>
-        <w:t>direcciones.usuario</w:t>
+        <w:t>direcciones.usuario_id</w:t>
       </w:r>
-      <w:proofErr w:type="gramEnd"/>
       <w:r>
-        <w:rPr>
-          <w:b/>
-        </w:rPr>
-        <w:t>_id</w:t>
-      </w:r>
-      <w:proofErr w:type="spellEnd"/>
-      <w:r>
-        <w:t xml:space="preserve"> → </w:t>
-      </w:r>
-      <w:proofErr w:type="spellStart"/>
-      <w:r>
-        <w:t>usuarios.id</w:t>
-      </w:r>
-      <w:proofErr w:type="spellEnd"/>
-      <w:r>
-        <w:t xml:space="preserve"> (ON DELETE CASCADE)</w:t>
+        <w:t xml:space="preserve"> → usuarios.id (ON DELETE CASCADE)</w:t>
       </w:r>
     </w:p>
     <w:p>
@@ -17447,30 +16552,15 @@
         </w:numPr>
         <w:spacing w:after="0"/>
       </w:pPr>
-      <w:proofErr w:type="spellStart"/>
-      <w:proofErr w:type="gramStart"/>
       <w:r>
         <w:rPr>
           <w:b/>
         </w:rPr>
-        <w:t>direcciones.comuna</w:t>
+        <w:t>direcciones.comuna_id</w:t>
       </w:r>
-      <w:proofErr w:type="gramEnd"/>
       <w:r>
-        <w:rPr>
-          <w:b/>
-        </w:rPr>
-        <w:t>_id</w:t>
+        <w:t xml:space="preserve"> → cat_comuna.id</w:t>
       </w:r>
-      <w:proofErr w:type="spellEnd"/>
-      <w:r>
-        <w:t xml:space="preserve"> → </w:t>
-      </w:r>
-      <w:proofErr w:type="spellStart"/>
-      <w:r>
-        <w:t>cat_comuna.id</w:t>
-      </w:r>
-      <w:proofErr w:type="spellEnd"/>
     </w:p>
     <w:p>
       <w:pPr>
@@ -17480,24 +16570,14 @@
         </w:numPr>
         <w:spacing w:after="0"/>
       </w:pPr>
-      <w:proofErr w:type="spellStart"/>
       <w:r>
         <w:rPr>
           <w:b/>
         </w:rPr>
         <w:t>rol_permiso.rol_id</w:t>
       </w:r>
-      <w:proofErr w:type="spellEnd"/>
       <w:r>
-        <w:t xml:space="preserve"> → </w:t>
-      </w:r>
-      <w:proofErr w:type="spellStart"/>
-      <w:r>
-        <w:t>roles.id</w:t>
-      </w:r>
-      <w:proofErr w:type="spellEnd"/>
-      <w:r>
-        <w:t xml:space="preserve"> (ON DELETE CASCADE)</w:t>
+        <w:t xml:space="preserve"> → roles.id (ON DELETE CASCADE)</w:t>
       </w:r>
     </w:p>
     <w:p>
@@ -17508,38 +16588,14 @@
         </w:numPr>
         <w:spacing w:after="0"/>
       </w:pPr>
-      <w:proofErr w:type="spellStart"/>
       <w:r>
         <w:rPr>
           <w:b/>
         </w:rPr>
-        <w:t>rol_</w:t>
+        <w:t>rol_permiso.permiso_id</w:t>
       </w:r>
-      <w:proofErr w:type="gramStart"/>
       <w:r>
-        <w:rPr>
-          <w:b/>
-        </w:rPr>
-        <w:t>permiso.permiso</w:t>
-      </w:r>
-      <w:proofErr w:type="gramEnd"/>
-      <w:r>
-        <w:rPr>
-          <w:b/>
-        </w:rPr>
-        <w:t>_id</w:t>
-      </w:r>
-      <w:proofErr w:type="spellEnd"/>
-      <w:r>
-        <w:t xml:space="preserve"> → </w:t>
-      </w:r>
-      <w:proofErr w:type="spellStart"/>
-      <w:r>
-        <w:t>permisos.id</w:t>
-      </w:r>
-      <w:proofErr w:type="spellEnd"/>
-      <w:r>
-        <w:t xml:space="preserve"> (ON DELETE CASCADE)</w:t>
+        <w:t xml:space="preserve"> → permisos.id (ON DELETE CASCADE)</w:t>
       </w:r>
     </w:p>
     <w:p>
@@ -17550,38 +16606,14 @@
         </w:numPr>
         <w:spacing w:after="0"/>
       </w:pPr>
-      <w:proofErr w:type="spellStart"/>
       <w:r>
         <w:rPr>
           <w:b/>
         </w:rPr>
-        <w:t>usuario_</w:t>
+        <w:t>usuario_rol.usuario_id</w:t>
       </w:r>
-      <w:proofErr w:type="gramStart"/>
       <w:r>
-        <w:rPr>
-          <w:b/>
-        </w:rPr>
-        <w:t>rol.usuario</w:t>
-      </w:r>
-      <w:proofErr w:type="gramEnd"/>
-      <w:r>
-        <w:rPr>
-          <w:b/>
-        </w:rPr>
-        <w:t>_id</w:t>
-      </w:r>
-      <w:proofErr w:type="spellEnd"/>
-      <w:r>
-        <w:t xml:space="preserve"> → </w:t>
-      </w:r>
-      <w:proofErr w:type="spellStart"/>
-      <w:r>
-        <w:t>usuarios.id</w:t>
-      </w:r>
-      <w:proofErr w:type="spellEnd"/>
-      <w:r>
-        <w:t xml:space="preserve"> (ON DELETE CASCADE)</w:t>
+        <w:t xml:space="preserve"> → usuarios.id (ON DELETE CASCADE)</w:t>
       </w:r>
     </w:p>
     <w:p>
@@ -17591,25 +16623,22 @@
           <w:numId w:val="14"/>
         </w:numPr>
         <w:spacing w:after="0"/>
-      </w:pPr>
-      <w:proofErr w:type="spellStart"/>
+        <w:rPr>
+          <w:lang w:val="en-US"/>
+        </w:rPr>
+      </w:pPr>
       <w:r>
         <w:rPr>
           <w:b/>
+          <w:lang w:val="en-US"/>
         </w:rPr>
         <w:t>usuario_rol.rol_id</w:t>
       </w:r>
-      <w:proofErr w:type="spellEnd"/>
       <w:r>
-        <w:t xml:space="preserve"> → </w:t>
-      </w:r>
-      <w:proofErr w:type="spellStart"/>
-      <w:r>
-        <w:t>roles.id</w:t>
-      </w:r>
-      <w:proofErr w:type="spellEnd"/>
-      <w:r>
-        <w:t xml:space="preserve"> (ON DELETE CASCADE)</w:t>
+        <w:rPr>
+          <w:lang w:val="en-US"/>
+        </w:rPr>
+        <w:t xml:space="preserve"> → roles.id (ON DELETE CASCADE)</w:t>
       </w:r>
     </w:p>
     <w:p>
@@ -17620,32 +16649,14 @@
         </w:numPr>
         <w:spacing w:after="0"/>
       </w:pPr>
-      <w:proofErr w:type="spellStart"/>
-      <w:proofErr w:type="gramStart"/>
       <w:r>
         <w:rPr>
           <w:b/>
         </w:rPr>
-        <w:t>dispositivos.usuario</w:t>
+        <w:t>dispositivos.usuario_id</w:t>
       </w:r>
-      <w:proofErr w:type="gramEnd"/>
       <w:r>
-        <w:rPr>
-          <w:b/>
-        </w:rPr>
-        <w:t>_id</w:t>
-      </w:r>
-      <w:proofErr w:type="spellEnd"/>
-      <w:r>
-        <w:t xml:space="preserve"> → </w:t>
-      </w:r>
-      <w:proofErr w:type="spellStart"/>
-      <w:r>
-        <w:t>usuarios.id</w:t>
-      </w:r>
-      <w:proofErr w:type="spellEnd"/>
-      <w:r>
-        <w:t xml:space="preserve"> (ON DELETE CASCADE)</w:t>
+        <w:t xml:space="preserve"> → usuarios.id (ON DELETE CASCADE)</w:t>
       </w:r>
     </w:p>
     <w:p>
@@ -17656,30 +16667,15 @@
         </w:numPr>
         <w:spacing w:after="0"/>
       </w:pPr>
-      <w:proofErr w:type="spellStart"/>
-      <w:proofErr w:type="gramStart"/>
       <w:r>
         <w:rPr>
           <w:b/>
         </w:rPr>
-        <w:t>dispositivos.tipo</w:t>
+        <w:t>dispositivos.tipo_dispositivo_id</w:t>
       </w:r>
-      <w:proofErr w:type="gramEnd"/>
       <w:r>
-        <w:rPr>
-          <w:b/>
-        </w:rPr>
-        <w:t>_dispositivo_id</w:t>
+        <w:t xml:space="preserve"> → cat_tipo_dispositivo.id</w:t>
       </w:r>
-      <w:proofErr w:type="spellEnd"/>
-      <w:r>
-        <w:t xml:space="preserve"> → </w:t>
-      </w:r>
-      <w:proofErr w:type="spellStart"/>
-      <w:r>
-        <w:t>cat_tipo_dispositivo.id</w:t>
-      </w:r>
-      <w:proofErr w:type="spellEnd"/>
     </w:p>
     <w:p>
       <w:pPr>
@@ -17689,38 +16685,14 @@
         </w:numPr>
         <w:spacing w:after="0"/>
       </w:pPr>
-      <w:proofErr w:type="spellStart"/>
       <w:r>
         <w:rPr>
           <w:b/>
         </w:rPr>
-        <w:t>registros_</w:t>
+        <w:t>registros_consumo.usuario_id</w:t>
       </w:r>
-      <w:proofErr w:type="gramStart"/>
       <w:r>
-        <w:rPr>
-          <w:b/>
-        </w:rPr>
-        <w:t>consumo.usuario</w:t>
-      </w:r>
-      <w:proofErr w:type="gramEnd"/>
-      <w:r>
-        <w:rPr>
-          <w:b/>
-        </w:rPr>
-        <w:t>_id</w:t>
-      </w:r>
-      <w:proofErr w:type="spellEnd"/>
-      <w:r>
-        <w:t xml:space="preserve"> → </w:t>
-      </w:r>
-      <w:proofErr w:type="spellStart"/>
-      <w:r>
-        <w:t>usuarios.id</w:t>
-      </w:r>
-      <w:proofErr w:type="spellEnd"/>
-      <w:r>
-        <w:t xml:space="preserve"> (ON DELETE CASCADE)</w:t>
+        <w:t xml:space="preserve"> → usuarios.id (ON DELETE CASCADE)</w:t>
       </w:r>
     </w:p>
     <w:p>
@@ -17731,38 +16703,14 @@
         </w:numPr>
         <w:spacing w:after="0"/>
       </w:pPr>
-      <w:proofErr w:type="spellStart"/>
       <w:r>
         <w:rPr>
           <w:b/>
         </w:rPr>
-        <w:t>registros_</w:t>
+        <w:t>registros_consumo.dispositivo_id</w:t>
       </w:r>
-      <w:proofErr w:type="gramStart"/>
       <w:r>
-        <w:rPr>
-          <w:b/>
-        </w:rPr>
-        <w:t>consumo.dispositivo</w:t>
-      </w:r>
-      <w:proofErr w:type="gramEnd"/>
-      <w:r>
-        <w:rPr>
-          <w:b/>
-        </w:rPr>
-        <w:t>_id</w:t>
-      </w:r>
-      <w:proofErr w:type="spellEnd"/>
-      <w:r>
-        <w:t xml:space="preserve"> → </w:t>
-      </w:r>
-      <w:proofErr w:type="spellStart"/>
-      <w:r>
-        <w:t>dispositivos.id</w:t>
-      </w:r>
-      <w:proofErr w:type="spellEnd"/>
-      <w:r>
-        <w:t xml:space="preserve"> (ON DELETE SET NULL)</w:t>
+        <w:t xml:space="preserve"> → dispositivos.id (ON DELETE SET NULL)</w:t>
       </w:r>
     </w:p>
     <w:p>
@@ -17773,38 +16721,14 @@
         </w:numPr>
         <w:spacing w:after="0"/>
       </w:pPr>
-      <w:proofErr w:type="spellStart"/>
       <w:r>
         <w:rPr>
           <w:b/>
         </w:rPr>
-        <w:t>predicciones_</w:t>
+        <w:t>predicciones_consumo.usuario_id</w:t>
       </w:r>
-      <w:proofErr w:type="gramStart"/>
       <w:r>
-        <w:rPr>
-          <w:b/>
-        </w:rPr>
-        <w:t>consumo.usuario</w:t>
-      </w:r>
-      <w:proofErr w:type="gramEnd"/>
-      <w:r>
-        <w:rPr>
-          <w:b/>
-        </w:rPr>
-        <w:t>_id</w:t>
-      </w:r>
-      <w:proofErr w:type="spellEnd"/>
-      <w:r>
-        <w:t xml:space="preserve"> → </w:t>
-      </w:r>
-      <w:proofErr w:type="spellStart"/>
-      <w:r>
-        <w:t>usuarios.id</w:t>
-      </w:r>
-      <w:proofErr w:type="spellEnd"/>
-      <w:r>
-        <w:t xml:space="preserve"> (ON DELETE CASCADE)</w:t>
+        <w:t xml:space="preserve"> → usuarios.id (ON DELETE CASCADE)</w:t>
       </w:r>
     </w:p>
     <w:p>
@@ -17815,36 +16739,15 @@
         </w:numPr>
         <w:spacing w:after="0"/>
       </w:pPr>
-      <w:proofErr w:type="spellStart"/>
       <w:r>
         <w:rPr>
           <w:b/>
         </w:rPr>
-        <w:t>predicciones_</w:t>
+        <w:t>predicciones_consumo.nivel_alerta_id</w:t>
       </w:r>
-      <w:proofErr w:type="gramStart"/>
       <w:r>
-        <w:rPr>
-          <w:b/>
-        </w:rPr>
-        <w:t>consumo.nivel</w:t>
+        <w:t xml:space="preserve"> → cat_nivel_alerta.id</w:t>
       </w:r>
-      <w:proofErr w:type="gramEnd"/>
-      <w:r>
-        <w:rPr>
-          <w:b/>
-        </w:rPr>
-        <w:t>_alerta_id</w:t>
-      </w:r>
-      <w:proofErr w:type="spellEnd"/>
-      <w:r>
-        <w:t xml:space="preserve"> → </w:t>
-      </w:r>
-      <w:proofErr w:type="spellStart"/>
-      <w:r>
-        <w:t>cat_nivel_alerta.id</w:t>
-      </w:r>
-      <w:proofErr w:type="spellEnd"/>
     </w:p>
     <w:p>
       <w:pPr>
@@ -17854,33 +16757,15 @@
         </w:numPr>
         <w:spacing w:after="0"/>
       </w:pPr>
-      <w:proofErr w:type="spellStart"/>
-      <w:proofErr w:type="gramStart"/>
       <w:r>
         <w:rPr>
           <w:b/>
         </w:rPr>
         <w:lastRenderedPageBreak/>
-        <w:t>notificaciones.usuario</w:t>
+        <w:t>notificaciones.usuario_id</w:t>
       </w:r>
-      <w:proofErr w:type="gramEnd"/>
       <w:r>
-        <w:rPr>
-          <w:b/>
-        </w:rPr>
-        <w:t>_id</w:t>
-      </w:r>
-      <w:proofErr w:type="spellEnd"/>
-      <w:r>
-        <w:t xml:space="preserve"> → </w:t>
-      </w:r>
-      <w:proofErr w:type="spellStart"/>
-      <w:r>
-        <w:t>usuarios.id</w:t>
-      </w:r>
-      <w:proofErr w:type="spellEnd"/>
-      <w:r>
-        <w:t xml:space="preserve"> (ON DELETE CASCADE)</w:t>
+        <w:t xml:space="preserve"> → usuarios.id (ON DELETE CASCADE)</w:t>
       </w:r>
     </w:p>
     <w:p>
@@ -17891,30 +16776,15 @@
         </w:numPr>
         <w:spacing w:after="0"/>
       </w:pPr>
-      <w:proofErr w:type="spellStart"/>
-      <w:proofErr w:type="gramStart"/>
       <w:r>
         <w:rPr>
           <w:b/>
         </w:rPr>
-        <w:t>notificaciones.tipo</w:t>
+        <w:t>notificaciones.tipo_id</w:t>
       </w:r>
-      <w:proofErr w:type="gramEnd"/>
       <w:r>
-        <w:rPr>
-          <w:b/>
-        </w:rPr>
-        <w:t>_id</w:t>
+        <w:t xml:space="preserve"> → cat_tipo_notificacion.id</w:t>
       </w:r>
-      <w:proofErr w:type="spellEnd"/>
-      <w:r>
-        <w:t xml:space="preserve"> → </w:t>
-      </w:r>
-      <w:proofErr w:type="spellStart"/>
-      <w:r>
-        <w:t>cat_tipo_notificacion.id</w:t>
-      </w:r>
-      <w:proofErr w:type="spellEnd"/>
     </w:p>
     <w:p>
       <w:pPr>
@@ -17924,38 +16794,14 @@
         </w:numPr>
         <w:spacing w:after="240"/>
       </w:pPr>
-      <w:proofErr w:type="spellStart"/>
       <w:r>
         <w:rPr>
           <w:b/>
         </w:rPr>
-        <w:t>metricas_</w:t>
+        <w:t>metricas_mensuales.usuario_id</w:t>
       </w:r>
-      <w:proofErr w:type="gramStart"/>
       <w:r>
-        <w:rPr>
-          <w:b/>
-        </w:rPr>
-        <w:t>mensuales.usuario</w:t>
-      </w:r>
-      <w:proofErr w:type="gramEnd"/>
-      <w:r>
-        <w:rPr>
-          <w:b/>
-        </w:rPr>
-        <w:t>_id</w:t>
-      </w:r>
-      <w:proofErr w:type="spellEnd"/>
-      <w:r>
-        <w:t xml:space="preserve"> → </w:t>
-      </w:r>
-      <w:proofErr w:type="spellStart"/>
-      <w:r>
-        <w:t>usuarios.id</w:t>
-      </w:r>
-      <w:proofErr w:type="spellEnd"/>
-      <w:r>
-        <w:t xml:space="preserve"> (ON DELETE CASCADE)</w:t>
+        <w:t xml:space="preserve"> → usuarios.id (ON DELETE CASCADE)</w:t>
       </w:r>
     </w:p>
     <w:p>
@@ -17970,21 +16816,12 @@
       </w:pPr>
       <w:bookmarkStart w:id="41" w:name="_heading=h.q7pwkqhrhr9l" w:colFirst="0" w:colLast="0"/>
       <w:bookmarkEnd w:id="41"/>
-      <w:proofErr w:type="spellStart"/>
       <w:r>
         <w:rPr>
           <w:sz w:val="26"/>
           <w:szCs w:val="26"/>
         </w:rPr>
-        <w:t>Triggers</w:t>
-      </w:r>
-      <w:proofErr w:type="spellEnd"/>
-      <w:r>
-        <w:rPr>
-          <w:sz w:val="26"/>
-          <w:szCs w:val="26"/>
-        </w:rPr>
-        <w:t xml:space="preserve"> Automáticos:</w:t>
+        <w:t>Triggers Automáticos:</w:t>
       </w:r>
     </w:p>
     <w:p>
@@ -17995,24 +16832,14 @@
         </w:numPr>
         <w:spacing w:before="240" w:after="0"/>
       </w:pPr>
-      <w:proofErr w:type="spellStart"/>
       <w:r>
         <w:rPr>
           <w:b/>
         </w:rPr>
         <w:t>tg_usuarios_updated_at</w:t>
       </w:r>
-      <w:proofErr w:type="spellEnd"/>
       <w:r>
-        <w:t xml:space="preserve">: Actualiza automáticamente el campo </w:t>
-      </w:r>
-      <w:proofErr w:type="spellStart"/>
-      <w:r>
-        <w:t>actualizado_en</w:t>
-      </w:r>
-      <w:proofErr w:type="spellEnd"/>
-      <w:r>
-        <w:t xml:space="preserve"> en la tabla usuarios</w:t>
+        <w:t>: Actualiza automáticamente el campo actualizado_en en la tabla usuarios</w:t>
       </w:r>
     </w:p>
     <w:p>
@@ -18023,30 +16850,15 @@
         </w:numPr>
         <w:spacing w:after="0"/>
       </w:pPr>
-      <w:proofErr w:type="spellStart"/>
       <w:r>
         <w:rPr>
           <w:b/>
         </w:rPr>
         <w:t>tg_auth_identidades_updated_at</w:t>
       </w:r>
-      <w:proofErr w:type="spellEnd"/>
       <w:r>
-        <w:t xml:space="preserve">: Actualiza automáticamente el campo </w:t>
+        <w:t>: Actualiza automáticamente el campo actualizado_en en auth_identidades</w:t>
       </w:r>
-      <w:proofErr w:type="spellStart"/>
-      <w:r>
-        <w:t>actualizado_en</w:t>
-      </w:r>
-      <w:proofErr w:type="spellEnd"/>
-      <w:r>
-        <w:t xml:space="preserve"> en </w:t>
-      </w:r>
-      <w:proofErr w:type="spellStart"/>
-      <w:r>
-        <w:t>auth_identidades</w:t>
-      </w:r>
-      <w:proofErr w:type="spellEnd"/>
     </w:p>
     <w:p>
       <w:pPr>
@@ -18056,24 +16868,14 @@
         </w:numPr>
         <w:spacing w:after="0"/>
       </w:pPr>
-      <w:proofErr w:type="spellStart"/>
       <w:r>
         <w:rPr>
           <w:b/>
         </w:rPr>
         <w:t>tg_perfiles_updated_at</w:t>
       </w:r>
-      <w:proofErr w:type="spellEnd"/>
       <w:r>
-        <w:t xml:space="preserve">: Actualiza automáticamente el campo </w:t>
-      </w:r>
-      <w:proofErr w:type="spellStart"/>
-      <w:r>
-        <w:t>actualizado_en</w:t>
-      </w:r>
-      <w:proofErr w:type="spellEnd"/>
-      <w:r>
-        <w:t xml:space="preserve"> en perfiles</w:t>
+        <w:t>: Actualiza automáticamente el campo actualizado_en en perfiles</w:t>
       </w:r>
     </w:p>
     <w:p>
@@ -18084,24 +16886,14 @@
         </w:numPr>
         <w:spacing w:after="240"/>
       </w:pPr>
-      <w:proofErr w:type="spellStart"/>
       <w:r>
         <w:rPr>
           <w:b/>
         </w:rPr>
         <w:t>tg_direcciones_updated_at</w:t>
       </w:r>
-      <w:proofErr w:type="spellEnd"/>
       <w:r>
-        <w:t xml:space="preserve">: Actualiza automáticamente el campo </w:t>
-      </w:r>
-      <w:proofErr w:type="spellStart"/>
-      <w:r>
-        <w:t>actualizado_en</w:t>
-      </w:r>
-      <w:proofErr w:type="spellEnd"/>
-      <w:r>
-        <w:t xml:space="preserve"> en direcciones</w:t>
+        <w:t>: Actualiza automáticamente el campo actualizado_en en direcciones</w:t>
       </w:r>
     </w:p>
     <w:p>
@@ -18132,24 +16924,14 @@
         </w:numPr>
         <w:spacing w:before="240" w:after="240"/>
       </w:pPr>
-      <w:proofErr w:type="spellStart"/>
       <w:r>
         <w:rPr>
           <w:b/>
         </w:rPr>
         <w:t>fuente_lectura</w:t>
       </w:r>
-      <w:proofErr w:type="spellEnd"/>
       <w:r>
-        <w:t>: ('manual', '</w:t>
-      </w:r>
-      <w:proofErr w:type="spellStart"/>
-      <w:r>
-        <w:t>automatica</w:t>
-      </w:r>
-      <w:proofErr w:type="spellEnd"/>
-      <w:r>
-        <w:t>')</w:t>
+        <w:t>: ('manual', 'automatica')</w:t>
       </w:r>
     </w:p>
     <w:p>
@@ -18180,7 +16962,7 @@
 </file>
 
 <file path=word/numbering.xml><?xml version="1.0" encoding="utf-8"?>
-<w:numbering xmlns:wpc="http://schemas.microsoft.com/office/word/2010/wordprocessingCanvas" xmlns:cx="http://schemas.microsoft.com/office/drawing/2014/chartex" xmlns:cx1="http://schemas.microsoft.com/office/drawing/2015/9/8/chartex" xmlns:cx2="http://schemas.microsoft.com/office/drawing/2015/10/21/chartex" xmlns:cx3="http://schemas.microsoft.com/office/drawing/2016/5/9/chartex" xmlns:cx4="http://schemas.microsoft.com/office/drawing/2016/5/10/chartex" xmlns:cx5="http://schemas.microsoft.com/office/drawing/2016/5/11/chartex" xmlns:cx6="http://schemas.microsoft.com/office/drawing/2016/5/12/chartex" xmlns:cx7="http://schemas.microsoft.com/office/drawing/2016/5/13/chartex" xmlns:cx8="http://schemas.microsoft.com/office/drawing/2016/5/14/chartex" xmlns:mc="http://schemas.openxmlformats.org/markup-compatibility/2006" xmlns:aink="http://schemas.microsoft.com/office/drawing/2016/ink" xmlns:am3d="http://schemas.microsoft.com/office/drawing/2017/model3d" xmlns:o="urn:schemas-microsoft-com:office:office" xmlns:oel="http://schemas.microsoft.com/office/2019/extlst" xmlns:r="http://schemas.openxmlformats.org/officeDocument/2006/relationships" xmlns:m="http://schemas.openxmlformats.org/officeDocument/2006/math" xmlns:v="urn:schemas-microsoft-com:vml" xmlns:wp14="http://schemas.microsoft.com/office/word/2010/wordprocessingDrawing" xmlns:wp="http://schemas.openxmlformats.org/drawingml/2006/wordprocessingDrawing" xmlns:w10="urn:schemas-microsoft-com:office:word" xmlns:w="http://schemas.openxmlformats.org/wordprocessingml/2006/main" xmlns:w14="http://schemas.microsoft.com/office/word/2010/wordml" xmlns:w15="http://schemas.microsoft.com/office/word/2012/wordml" xmlns:w16cex="http://schemas.microsoft.com/office/word/2018/wordml/cex" xmlns:w16cid="http://schemas.microsoft.com/office/word/2016/wordml/cid" xmlns:w16="http://schemas.microsoft.com/office/word/2018/wordml" xmlns:w16sdtdh="http://schemas.microsoft.com/office/word/2020/wordml/sdtdatahash" xmlns:w16se="http://schemas.microsoft.com/office/word/2015/wordml/symex" xmlns:wpg="http://schemas.microsoft.com/office/word/2010/wordprocessingGroup" xmlns:wpi="http://schemas.microsoft.com/office/word/2010/wordprocessingInk" xmlns:wne="http://schemas.microsoft.com/office/word/2006/wordml" xmlns:wps="http://schemas.microsoft.com/office/word/2010/wordprocessingShape" mc:Ignorable="w14 w15 w16se w16cid w16 w16cex w16sdtdh wp14">
+<w:numbering xmlns:wpc="http://schemas.microsoft.com/office/word/2010/wordprocessingCanvas" xmlns:cx="http://schemas.microsoft.com/office/drawing/2014/chartex" xmlns:cx1="http://schemas.microsoft.com/office/drawing/2015/9/8/chartex" xmlns:cx2="http://schemas.microsoft.com/office/drawing/2015/10/21/chartex" xmlns:cx3="http://schemas.microsoft.com/office/drawing/2016/5/9/chartex" xmlns:cx4="http://schemas.microsoft.com/office/drawing/2016/5/10/chartex" xmlns:cx5="http://schemas.microsoft.com/office/drawing/2016/5/11/chartex" xmlns:cx6="http://schemas.microsoft.com/office/drawing/2016/5/12/chartex" xmlns:cx7="http://schemas.microsoft.com/office/drawing/2016/5/13/chartex" xmlns:cx8="http://schemas.microsoft.com/office/drawing/2016/5/14/chartex" xmlns:mc="http://schemas.openxmlformats.org/markup-compatibility/2006" xmlns:aink="http://schemas.microsoft.com/office/drawing/2016/ink" xmlns:am3d="http://schemas.microsoft.com/office/drawing/2017/model3d" xmlns:o="urn:schemas-microsoft-com:office:office" xmlns:oel="http://schemas.microsoft.com/office/2019/extlst" xmlns:r="http://schemas.openxmlformats.org/officeDocument/2006/relationships" xmlns:m="http://schemas.openxmlformats.org/officeDocument/2006/math" xmlns:v="urn:schemas-microsoft-com:vml" xmlns:wp14="http://schemas.microsoft.com/office/word/2010/wordprocessingDrawing" xmlns:wp="http://schemas.openxmlformats.org/drawingml/2006/wordprocessingDrawing" xmlns:w10="urn:schemas-microsoft-com:office:word" xmlns:w="http://schemas.openxmlformats.org/wordprocessingml/2006/main" xmlns:w14="http://schemas.microsoft.com/office/word/2010/wordml" xmlns:w15="http://schemas.microsoft.com/office/word/2012/wordml" xmlns:w16cex="http://schemas.microsoft.com/office/word/2018/wordml/cex" xmlns:w16cid="http://schemas.microsoft.com/office/word/2016/wordml/cid" xmlns:w16="http://schemas.microsoft.com/office/word/2018/wordml" xmlns:w16du="http://schemas.microsoft.com/office/word/2023/wordml/word16du" xmlns:w16sdtdh="http://schemas.microsoft.com/office/word/2020/wordml/sdtdatahash" xmlns:w16sdtfl="http://schemas.microsoft.com/office/word/2024/wordml/sdtformatlock" xmlns:w16se="http://schemas.microsoft.com/office/word/2015/wordml/symex" xmlns:wpg="http://schemas.microsoft.com/office/word/2010/wordprocessingGroup" xmlns:wpi="http://schemas.microsoft.com/office/word/2010/wordprocessingInk" xmlns:wne="http://schemas.microsoft.com/office/word/2006/wordml" xmlns:wps="http://schemas.microsoft.com/office/word/2010/wordprocessingShape" mc:Ignorable="w14 w15 w16se w16cid w16 w16cex w16sdtdh w16sdtfl w16du wp14">
   <w:abstractNum w:abstractNumId="0" w15:restartNumberingAfterBreak="0">
     <w:nsid w:val="11714CF6"/>
     <w:multiLevelType w:val="multilevel"/>
@@ -20041,7 +18823,7 @@
 </file>
 
 <file path=word/styles.xml><?xml version="1.0" encoding="utf-8"?>
-<w:styles xmlns:mc="http://schemas.openxmlformats.org/markup-compatibility/2006" xmlns:r="http://schemas.openxmlformats.org/officeDocument/2006/relationships" xmlns:w="http://schemas.openxmlformats.org/wordprocessingml/2006/main" xmlns:w14="http://schemas.microsoft.com/office/word/2010/wordml" xmlns:w15="http://schemas.microsoft.com/office/word/2012/wordml" xmlns:w16cex="http://schemas.microsoft.com/office/word/2018/wordml/cex" xmlns:w16cid="http://schemas.microsoft.com/office/word/2016/wordml/cid" xmlns:w16="http://schemas.microsoft.com/office/word/2018/wordml" xmlns:w16sdtdh="http://schemas.microsoft.com/office/word/2020/wordml/sdtdatahash" xmlns:w16se="http://schemas.microsoft.com/office/word/2015/wordml/symex" mc:Ignorable="w14 w15 w16se w16cid w16 w16cex w16sdtdh">
+<w:styles xmlns:mc="http://schemas.openxmlformats.org/markup-compatibility/2006" xmlns:r="http://schemas.openxmlformats.org/officeDocument/2006/relationships" xmlns:w="http://schemas.openxmlformats.org/wordprocessingml/2006/main" xmlns:w14="http://schemas.microsoft.com/office/word/2010/wordml" xmlns:w15="http://schemas.microsoft.com/office/word/2012/wordml" xmlns:w16cex="http://schemas.microsoft.com/office/word/2018/wordml/cex" xmlns:w16cid="http://schemas.microsoft.com/office/word/2016/wordml/cid" xmlns:w16="http://schemas.microsoft.com/office/word/2018/wordml" xmlns:w16du="http://schemas.microsoft.com/office/word/2023/wordml/word16du" xmlns:w16sdtdh="http://schemas.microsoft.com/office/word/2020/wordml/sdtdatahash" xmlns:w16sdtfl="http://schemas.microsoft.com/office/word/2024/wordml/sdtformatlock" xmlns:w16se="http://schemas.microsoft.com/office/word/2015/wordml/symex" mc:Ignorable="w14 w15 w16se w16cid w16 w16cex w16sdtdh w16sdtfl w16du">
   <w:docDefaults>
     <w:rPrDefault>
       <w:rPr>

</xml_diff>